<commit_message>
Rebuild: split tracks, Departures v2, booking-site UI, drawio ER, themed slides/PDF, split viva notes
</commit_message>
<xml_diff>
--- a/dbms/docs/SkyRoute_DBMS_Report.docx
+++ b/dbms/docs/SkyRoute_DBMS_Report.docx
@@ -12,17 +12,22 @@
     </w:p>
     <w:p>
       <w:r>
-        <w:t>DBMS Mini Project — Database Management System (CS/AI/AIM/DS202)</w:t>
+        <w:t>DBMS Mini Project - Database Management System (CS/AI/AIM/DS202)</w:t>
       </w:r>
     </w:p>
     <w:p>
       <w:r>
-        <w:t>Multi-airport relational database with SQL implementation, advanced features, transaction management, indexing and testing on MySQL 8.0.</w:t>
+        <w:t>Database: skyroute_db | Tables: 16 | MySQL 8.0</w:t>
       </w:r>
     </w:p>
     <w:p>
       <w:r>
-        <w:t>Database: skyroute_db | Tables: 18 | Seed volume: 140 flight instances, ~14,000 bookings, ~17,000 baggage records (deterministic generator, seed 42).</w:t>
+        <w:t>Seed volume: 140 departures, ~14,000 bookings, ~17,000 baggage records</w:t>
+      </w:r>
+    </w:p>
+    <w:p>
+      <w:r>
+        <w:t>(deterministic generator, seed 42).</w:t>
       </w:r>
     </w:p>
     <w:p>
@@ -35,7 +40,87 @@
     </w:p>
     <w:p>
       <w:r>
-        <w:t>Managing flight bookings, seat allocation, gate assignment and baggage handling across several airports by hand causes duplicate seat bookings, gate clashes, wrong baggage-fee computation and inconsistent data between stations. SkyRoute is a centralized relational database for five Indian airports and three airlines that automates scheduling, reservations, baggage tracking, payments and check-in. The schema separates timetable templates (Flights) from dated departures (Flight_Instances) so the system can hold an unlimited number of dated flights; models Terminal/Gate/Runway infrastructure per airport; and organises staff with a supertype/subtype hierarchy. Integrity rules live inside the database: a unique seat-per-instance key blocks double booking, a trigger blocks overselling past aircraft capacity, composite gate keys block gate clashes, and check constraints block impossible routes and weights. A stored procedure books a seat and opens its payment atomically, two reporting views serve the departure board and the booking receipt (including the overweight-baggage fee), transaction demos prove atomicity and isolation, and targeted indexes with before/after EXPLAIN checks prove the system stays fast at volume.</w:t>
+        <w:t>Managing flight bookings, seat allocation, gate assignment and baggage handling</w:t>
+      </w:r>
+    </w:p>
+    <w:p>
+      <w:r>
+        <w:t>across several airports by hand causes duplicate seat bookings, gate clashes,</w:t>
+      </w:r>
+    </w:p>
+    <w:p>
+      <w:r>
+        <w:t>wrong baggage-fee computation and inconsistent data between stations. SkyRoute</w:t>
+      </w:r>
+    </w:p>
+    <w:p>
+      <w:r>
+        <w:t>is a centralized relational database for five Indian airports and three airlines</w:t>
+      </w:r>
+    </w:p>
+    <w:p>
+      <w:r>
+        <w:t>that automates scheduling, reservations, baggage tracking, payments and</w:t>
+      </w:r>
+    </w:p>
+    <w:p>
+      <w:r>
+        <w:t>check-in. The schema separates timetable templates (Flights) from dated</w:t>
+      </w:r>
+    </w:p>
+    <w:p>
+      <w:r>
+        <w:t>departures (Departures) so the system can hold an unlimited number of</w:t>
+      </w:r>
+    </w:p>
+    <w:p>
+      <w:r>
+        <w:t>dated flights; models Terminal/Gate infrastructure per airport; and</w:t>
+      </w:r>
+    </w:p>
+    <w:p>
+      <w:r>
+        <w:t>organises staff with a supertype/subtype hierarchy. Integrity rules live inside</w:t>
+      </w:r>
+    </w:p>
+    <w:p>
+      <w:r>
+        <w:t>the database: a unique seat-per-departure key blocks double booking, a trigger</w:t>
+      </w:r>
+    </w:p>
+    <w:p>
+      <w:r>
+        <w:t>blocks overselling past aircraft capacity, composite gate keys block gate</w:t>
+      </w:r>
+    </w:p>
+    <w:p>
+      <w:r>
+        <w:t>clashes, and check constraints block impossible routes and weights. A stored</w:t>
+      </w:r>
+    </w:p>
+    <w:p>
+      <w:r>
+        <w:t>procedure books a seat and opens its payment atomically, two reporting views</w:t>
+      </w:r>
+    </w:p>
+    <w:p>
+      <w:r>
+        <w:t>serve the departure board and the booking receipt (including the</w:t>
+      </w:r>
+    </w:p>
+    <w:p>
+      <w:r>
+        <w:t>overweight-baggage fee), transaction demos prove atomicity and isolation, and</w:t>
+      </w:r>
+    </w:p>
+    <w:p>
+      <w:r>
+        <w:t>targeted indexes with before/after EXPLAIN checks prove the system stays fast</w:t>
+      </w:r>
+    </w:p>
+    <w:p>
+      <w:r>
+        <w:t>at volume.</w:t>
       </w:r>
     </w:p>
     <w:p>
@@ -48,7 +133,17 @@
     </w:p>
     <w:p>
       <w:r>
-        <w:t>SkyRoute: Airline Ticket and Baggage Management System. The title reflects the real-world problem solved — ticketing and baggage handling for scheduled airline operations across multiple airports — rather than a single-route shuttle.</w:t>
+        <w:t>SkyRoute: Airline Ticket and Baggage Management System. The title reflects the</w:t>
+      </w:r>
+    </w:p>
+    <w:p>
+      <w:r>
+        <w:t>real-world problem solved - ticketing and baggage handling for scheduled airline</w:t>
+      </w:r>
+    </w:p>
+    <w:p>
+      <w:r>
+        <w:t>operations across multiple airports - rather than a single-route shuttle.</w:t>
       </w:r>
     </w:p>
     <w:p>
@@ -61,7 +156,7 @@
     </w:p>
     <w:p>
       <w:r>
-        <w:t>Manual and single-station booking workflows observed at HYD and BLR suffer five concrete failures: (1) duplicate seat booking on the same flight when two agents sell concurrently; (2) gate assignment clashes written down wrongly between flights; (3) baggage fees miscalculated when weight exceeds the 20 kg free allowance; (4) no single database shared by flights, passengers and bookings across stations; (5) no automated guard when a flight sells more seats than the aircraft holds. Each failure maps to exactly one database mechanism built in Sections 7–9, so every problem statement item is provably closed.</w:t>
+        <w:t>Manual and single-station booking workflows suffer five concrete failures:</w:t>
       </w:r>
     </w:p>
     <w:p>
@@ -69,7 +164,12 @@
         <w:pStyle w:val="ListBullet"/>
       </w:pPr>
       <w:r>
-        <w:t>Duplicate seat booking -&gt; UNIQUE(instance_id, seat_number).</w:t>
+        <w:t>Duplicate seat booking on the same flight when two agents sell concurrently -</w:t>
+      </w:r>
+    </w:p>
+    <w:p>
+      <w:r>
+        <w:t>closed by UNIQUE(departure_id, seat_number).</w:t>
       </w:r>
     </w:p>
     <w:p>
@@ -77,7 +177,12 @@
         <w:pStyle w:val="ListBullet"/>
       </w:pPr>
       <w:r>
-        <w:t>Gate clash -&gt; UNIQUE(terminal_id, gate_number) plus gate rotation in scheduling.</w:t>
+        <w:t>Gate assignment clashes written down wrongly between flights - closed by</w:t>
+      </w:r>
+    </w:p>
+    <w:p>
+      <w:r>
+        <w:t>UNIQUE(terminal_id, gate_number) plus gate rotation in scheduling.</w:t>
       </w:r>
     </w:p>
     <w:p>
@@ -85,7 +190,12 @@
         <w:pStyle w:val="ListBullet"/>
       </w:pPr>
       <w:r>
-        <w:t>Wrong baggage fee -&gt; fee rule encoded once in booking_receipt_view.</w:t>
+        <w:t>Baggage fees miscalculated above the 20 kg free allowance - closed by the fee</w:t>
+      </w:r>
+    </w:p>
+    <w:p>
+      <w:r>
+        <w:t>rule encoded once in booking_receipt_view (Rs 500 per excess kg).</w:t>
       </w:r>
     </w:p>
     <w:p>
@@ -93,7 +203,7 @@
         <w:pStyle w:val="ListBullet"/>
       </w:pPr>
       <w:r>
-        <w:t>No single database -&gt; one skyroute_db serving all five airports.</w:t>
+        <w:t>No single database shared by flights, passengers and bookings across stations</w:t>
       </w:r>
     </w:p>
     <w:p>
@@ -101,7 +211,20 @@
         <w:pStyle w:val="ListBullet"/>
       </w:pPr>
       <w:r>
-        <w:t>Overselling -&gt; trg_booking_capacity trigger against aircraft capacity.</w:t>
+        <w:t>closed by one skyroute_db serving all five airports.</w:t>
+      </w:r>
+    </w:p>
+    <w:p>
+      <w:pPr>
+        <w:pStyle w:val="ListBullet"/>
+      </w:pPr>
+      <w:r>
+        <w:t>No automated guard when a flight sells more seats than the aircraft holds -</w:t>
+      </w:r>
+    </w:p>
+    <w:p>
+      <w:r>
+        <w:t>closed by the trg_booking_capacity trigger against aircraft capacity.</w:t>
       </w:r>
     </w:p>
     <w:p>
@@ -125,7 +248,7 @@
         <w:pStyle w:val="ListBullet"/>
       </w:pPr>
       <w:r>
-        <w:t>Make double seat booking and overselling impossible at the storage engine level.</w:t>
+        <w:t>Make double seat booking and overselling impossible at the storage-engine level.</w:t>
       </w:r>
     </w:p>
     <w:p>
@@ -169,75 +292,33 @@
       </w:r>
     </w:p>
     <w:p>
-      <w:pPr>
-        <w:pStyle w:val="Heading2"/>
-      </w:pPr>
       <w:r>
-        <w:t>Functional requirements</w:t>
+        <w:t>Functional: add, edit and view airports, airlines, aircraft, flights and dated</w:t>
       </w:r>
     </w:p>
     <w:p>
-      <w:pPr>
-        <w:pStyle w:val="ListBullet"/>
-      </w:pPr>
       <w:r>
-        <w:t>Add, edit and view airports, airlines, aircraft, flights and dated instances.</w:t>
+        <w:t>departures; assign aircraft, gate and crew to each dated departure;</w:t>
       </w:r>
     </w:p>
     <w:p>
-      <w:pPr>
-        <w:pStyle w:val="ListBullet"/>
-      </w:pPr>
       <w:r>
-        <w:t>Assign aircraft, gate, runway and crew to each dated departure.</w:t>
+        <w:t>reserve seats and create bookings; log baggage weight per booking; record</w:t>
       </w:r>
     </w:p>
     <w:p>
-      <w:pPr>
-        <w:pStyle w:val="ListBullet"/>
-      </w:pPr>
       <w:r>
-        <w:t>Reserve seats and create bookings; log baggage weight per booking.</w:t>
+        <w:t>payments and check-ins; manage staff and roles.</w:t>
       </w:r>
     </w:p>
     <w:p>
-      <w:pPr>
-        <w:pStyle w:val="ListBullet"/>
-      </w:pPr>
       <w:r>
-        <w:t>Record payments and check-ins; manage staff and roles.</w:t>
+        <w:t>Non-functional: fast query response at tens of thousands of rows; data integrity</w:t>
       </w:r>
     </w:p>
     <w:p>
-      <w:pPr>
-        <w:pStyle w:val="Heading2"/>
-      </w:pPr>
       <w:r>
-        <w:t>Non-functional requirements</w:t>
-      </w:r>
-    </w:p>
-    <w:p>
-      <w:pPr>
-        <w:pStyle w:val="ListBullet"/>
-      </w:pPr>
-      <w:r>
-        <w:t>Fast query response at tens of thousands of rows (indexes + EXPLAIN proof).</w:t>
-      </w:r>
-    </w:p>
-    <w:p>
-      <w:pPr>
-        <w:pStyle w:val="ListBullet"/>
-      </w:pPr>
-      <w:r>
-        <w:t>Data integrity under concurrent sellers (constraints + transactions).</w:t>
-      </w:r>
-    </w:p>
-    <w:p>
-      <w:pPr>
-        <w:pStyle w:val="ListBullet"/>
-      </w:pPr>
-      <w:r>
-        <w:t>Secure access (three least-privilege database roles).</w:t>
+        <w:t>under concurrent sellers; secure access.</w:t>
       </w:r>
     </w:p>
     <w:p>
@@ -250,7 +331,32 @@
     </w:p>
     <w:p>
       <w:r>
-        <w:t>Entities: Airport, Airline, Aircraft, Flight, Flight_Instance, Terminal, Gate, Runway, Passenger, Booking, Baggage (weak, double-bordered), Payment, Check_In, Employee (supertype) with Pilot, Crew_Member, Ground_Staff subtypes, and Crew_Assignment as the associative entity between staff and dated flights. Key relationships: Airline 1—N Aircraft; Flight N—1 Airports (departure and arrival roles); Flight 1—N Flight_Instances; Airport 1—N Terminals 1—N Gates; Passenger 1—N Bookings N—1 Flight_Instances; Booking 1—N Baggage (identifying) and 1—1 Payment / Check_In. Cardinalities and keys were drawn in draw.io from this model before any CREATE TABLE was written.</w:t>
+        <w:t>Entities: Airport, Airline, Aircraft, Flight, Departure, Terminal, Gate, Passenger, Booking, Baggage (weak), Payment, Check_In, Employee</w:t>
+      </w:r>
+    </w:p>
+    <w:p>
+      <w:r>
+        <w:t>(supertype) with Pilot, Crew_Member, Ground_Staff subtypes.</w:t>
+      </w:r>
+    </w:p>
+    <w:p>
+      <w:r>
+        <w:t>Relationships: Airline 1-N Aircraft; Flight N-1 Airports (departure and arrival</w:t>
+      </w:r>
+    </w:p>
+    <w:p>
+      <w:r>
+        <w:t>roles); Flight 1-N Departures; Airport 1-N Terminals 1-N Gates; Passenger</w:t>
+      </w:r>
+    </w:p>
+    <w:p>
+      <w:r>
+        <w:t>1-N Bookings N-1 Departures; Booking 1-N Baggage (identifying) and 1-1</w:t>
+      </w:r>
+    </w:p>
+    <w:p>
+      <w:r>
+        <w:t>Payment / Check_In. (Diagram: ER_Diagram.png.)</w:t>
       </w:r>
     </w:p>
     <w:p>
@@ -259,11 +365,6 @@
       </w:pPr>
       <w:r>
         <w:t>6. Schema Design (Relational Model)</w:t>
-      </w:r>
-    </w:p>
-    <w:p>
-      <w:r>
-        <w:t>The ER model converts to 18 InnoDB tables. Surrogate integer primary keys keep foreign keys narrow at scale; natural business keys (IATA codes, tail numbers, licences, emails, transaction references) carry UNIQUE constraints instead. Normalisation: repeating groups are removed into masters (airline/aircraft data live once, not inside every flight row) for 1NF; every non-key attribute depends on the whole key (2NF — e.g. gate status depends on gate_id, never on a booking); no transitive dependencies remain (3NF — city depends on airport, and flights reference the airport rather than copying its city). The design is BCNF-clean: every determinant in every table is a key.</w:t>
       </w:r>
     </w:p>
     <w:tbl>
@@ -294,7 +395,7 @@
           </w:tcPr>
           <w:p>
             <w:r>
-              <w:t>PK</w:t>
+              <w:t>Primary key</w:t>
             </w:r>
           </w:p>
         </w:tc>
@@ -304,7 +405,7 @@
           </w:tcPr>
           <w:p>
             <w:r>
-              <w:t>Key rules</w:t>
+              <w:t>Rule that matters</w:t>
             </w:r>
           </w:p>
         </w:tc>
@@ -336,7 +437,7 @@
           </w:tcPr>
           <w:p>
             <w:r>
-              <w:t>UNIQUE iata_code, airport_name</w:t>
+              <w:t>UNIQUE iata, name</w:t>
             </w:r>
           </w:p>
         </w:tc>
@@ -368,7 +469,7 @@
           </w:tcPr>
           <w:p>
             <w:r>
-              <w:t>UNIQUE name, iata_code</w:t>
+              <w:t>UNIQUE name, iata</w:t>
             </w:r>
           </w:p>
         </w:tc>
@@ -400,7 +501,7 @@
           </w:tcPr>
           <w:p>
             <w:r>
-              <w:t>UNIQUE tail_number; CHECK capacity 1..850</w:t>
+              <w:t>UNIQUE tail; CHECK cap 1-850</w:t>
             </w:r>
           </w:p>
         </w:tc>
@@ -432,7 +533,7 @@
           </w:tcPr>
           <w:p>
             <w:r>
-              <w:t>UNIQUE flight_number; two airport FKs; CHECK dep &lt;&gt; arr</w:t>
+              <w:t>UNIQUE number; dep &lt;&gt; arr airports</w:t>
             </w:r>
           </w:p>
         </w:tc>
@@ -444,7 +545,7 @@
           </w:tcPr>
           <w:p>
             <w:r>
-              <w:t>Flight_Instances</w:t>
+              <w:t>Departures</w:t>
             </w:r>
           </w:p>
         </w:tc>
@@ -454,7 +555,7 @@
           </w:tcPr>
           <w:p>
             <w:r>
-              <w:t>instance_id</w:t>
+              <w:t>departure_id</w:t>
             </w:r>
           </w:p>
         </w:tc>
@@ -464,7 +565,7 @@
           </w:tcPr>
           <w:p>
             <w:r>
-              <w:t>UNIQUE(flight_id, scheduled_departure); CHECK arr &gt; dep</w:t>
+              <w:t>UNIQUE(flight, dep datetime)</w:t>
             </w:r>
           </w:p>
         </w:tc>
@@ -476,7 +577,7 @@
           </w:tcPr>
           <w:p>
             <w:r>
-              <w:t>Terminals</w:t>
+              <w:t>Terminals / Gates</w:t>
             </w:r>
           </w:p>
         </w:tc>
@@ -486,7 +587,7 @@
           </w:tcPr>
           <w:p>
             <w:r>
-              <w:t>terminal_id</w:t>
+              <w:t>own ids</w:t>
             </w:r>
           </w:p>
         </w:tc>
@@ -496,71 +597,7 @@
           </w:tcPr>
           <w:p>
             <w:r>
-              <w:t>UNIQUE(airport_id, terminal_code)</w:t>
-            </w:r>
-          </w:p>
-        </w:tc>
-      </w:tr>
-      <w:tr>
-        <w:tc>
-          <w:tcPr>
-            <w:tcW w:type="dxa" w:w="2880"/>
-          </w:tcPr>
-          <w:p>
-            <w:r>
-              <w:t>Gates</w:t>
-            </w:r>
-          </w:p>
-        </w:tc>
-        <w:tc>
-          <w:tcPr>
-            <w:tcW w:type="dxa" w:w="2880"/>
-          </w:tcPr>
-          <w:p>
-            <w:r>
-              <w:t>gate_id</w:t>
-            </w:r>
-          </w:p>
-        </w:tc>
-        <w:tc>
-          <w:tcPr>
-            <w:tcW w:type="dxa" w:w="2880"/>
-          </w:tcPr>
-          <w:p>
-            <w:r>
-              <w:t>UNIQUE(terminal_id, gate_number)</w:t>
-            </w:r>
-          </w:p>
-        </w:tc>
-      </w:tr>
-      <w:tr>
-        <w:tc>
-          <w:tcPr>
-            <w:tcW w:type="dxa" w:w="2880"/>
-          </w:tcPr>
-          <w:p>
-            <w:r>
-              <w:t>Runways</w:t>
-            </w:r>
-          </w:p>
-        </w:tc>
-        <w:tc>
-          <w:tcPr>
-            <w:tcW w:type="dxa" w:w="2880"/>
-          </w:tcPr>
-          <w:p>
-            <w:r>
-              <w:t>runway_id</w:t>
-            </w:r>
-          </w:p>
-        </w:tc>
-        <w:tc>
-          <w:tcPr>
-            <w:tcW w:type="dxa" w:w="2880"/>
-          </w:tcPr>
-          <w:p>
-            <w:r>
-              <w:t>UNIQUE(airport_id, runway_code)</w:t>
+              <w:t>UNIQUE per parent (anti-clash)</w:t>
             </w:r>
           </w:p>
         </w:tc>
@@ -624,7 +661,7 @@
           </w:tcPr>
           <w:p>
             <w:r>
-              <w:t>UNIQUE(instance_id, seat_number)</w:t>
+              <w:t>UNIQUE(departure, seat)</w:t>
             </w:r>
           </w:p>
         </w:tc>
@@ -646,7 +683,7 @@
           </w:tcPr>
           <w:p>
             <w:r>
-              <w:t>(booking_id, baggage_seq)</w:t>
+              <w:t>(booking, seq)</w:t>
             </w:r>
           </w:p>
         </w:tc>
@@ -656,7 +693,7 @@
           </w:tcPr>
           <w:p>
             <w:r>
-              <w:t>weak entity; CHECK 0 &lt; kg &lt;= 100</w:t>
+              <w:t>weak entity; 0 &lt; kg &lt;= 100</w:t>
             </w:r>
           </w:p>
         </w:tc>
@@ -668,7 +705,7 @@
           </w:tcPr>
           <w:p>
             <w:r>
-              <w:t>Payments</w:t>
+              <w:t>Payments / Check-Ins</w:t>
             </w:r>
           </w:p>
         </w:tc>
@@ -678,7 +715,7 @@
           </w:tcPr>
           <w:p>
             <w:r>
-              <w:t>payment_id</w:t>
+              <w:t>own ids</w:t>
             </w:r>
           </w:p>
         </w:tc>
@@ -688,7 +725,7 @@
           </w:tcPr>
           <w:p>
             <w:r>
-              <w:t>UNIQUE booking_id, txn_reference</w:t>
+              <w:t>UNIQUE booking (one-to-one)</w:t>
             </w:r>
           </w:p>
         </w:tc>
@@ -700,39 +737,7 @@
           </w:tcPr>
           <w:p>
             <w:r>
-              <w:t>Check_Ins</w:t>
-            </w:r>
-          </w:p>
-        </w:tc>
-        <w:tc>
-          <w:tcPr>
-            <w:tcW w:type="dxa" w:w="2880"/>
-          </w:tcPr>
-          <w:p>
-            <w:r>
-              <w:t>checkin_id</w:t>
-            </w:r>
-          </w:p>
-        </w:tc>
-        <w:tc>
-          <w:tcPr>
-            <w:tcW w:type="dxa" w:w="2880"/>
-          </w:tcPr>
-          <w:p>
-            <w:r>
-              <w:t>UNIQUE booking_id</w:t>
-            </w:r>
-          </w:p>
-        </w:tc>
-      </w:tr>
-      <w:tr>
-        <w:tc>
-          <w:tcPr>
-            <w:tcW w:type="dxa" w:w="2880"/>
-          </w:tcPr>
-          <w:p>
-            <w:r>
-              <w:t>Employees + 3 subtypes</w:t>
+              <w:t>Employees + subtypes</w:t>
             </w:r>
           </w:p>
         </w:tc>
@@ -752,45 +757,115 @@
           </w:tcPr>
           <w:p>
             <w:r>
-              <w:t>subtype PK = supertype PK; UNIQUE email/licence</w:t>
-            </w:r>
-          </w:p>
-        </w:tc>
-      </w:tr>
-      <w:tr>
-        <w:tc>
-          <w:tcPr>
-            <w:tcW w:type="dxa" w:w="2880"/>
-          </w:tcPr>
-          <w:p>
-            <w:r>
-              <w:t>Crew_Assignments</w:t>
-            </w:r>
-          </w:p>
-        </w:tc>
-        <w:tc>
-          <w:tcPr>
-            <w:tcW w:type="dxa" w:w="2880"/>
-          </w:tcPr>
-          <w:p>
-            <w:r>
-              <w:t>assignment_id</w:t>
-            </w:r>
-          </w:p>
-        </w:tc>
-        <w:tc>
-          <w:tcPr>
-            <w:tcW w:type="dxa" w:w="2880"/>
-          </w:tcPr>
-          <w:p>
-            <w:r>
-              <w:t>UNIQUE(employee, instance)</w:t>
+              <w:t>subtype PK = supertype PK</w:t>
             </w:r>
           </w:p>
         </w:tc>
       </w:tr>
     </w:tbl>
     <w:p/>
+    <w:p>
+      <w:r>
+        <w:t>16 InnoDB tables. Surrogate integer primary keys keep foreign keys narrow at</w:t>
+      </w:r>
+    </w:p>
+    <w:p>
+      <w:r>
+        <w:t>scale; natural business keys (IATA codes, tail numbers, licences, emails,</w:t>
+      </w:r>
+    </w:p>
+    <w:p>
+      <w:r>
+        <w:t>transaction references) carry UNIQUE constraints instead.</w:t>
+      </w:r>
+    </w:p>
+    <w:p>
+      <w:pPr>
+        <w:pStyle w:val="ListBullet"/>
+      </w:pPr>
+      <w:r>
+        <w:t>1NF: repeating groups removed into masters (airline/aircraft data live once,</w:t>
+      </w:r>
+    </w:p>
+    <w:p>
+      <w:r>
+        <w:t>not inside every flight row).</w:t>
+      </w:r>
+    </w:p>
+    <w:p>
+      <w:pPr>
+        <w:pStyle w:val="ListBullet"/>
+      </w:pPr>
+      <w:r>
+        <w:t>2NF: every non-key attribute depends on the whole key (gate status depends on</w:t>
+      </w:r>
+    </w:p>
+    <w:p>
+      <w:r>
+        <w:t>gate_id, never on a booking).</w:t>
+      </w:r>
+    </w:p>
+    <w:p>
+      <w:pPr>
+        <w:pStyle w:val="ListBullet"/>
+      </w:pPr>
+      <w:r>
+        <w:t>3NF: no transitive dependencies (city depends on airport; flights reference</w:t>
+      </w:r>
+    </w:p>
+    <w:p>
+      <w:r>
+        <w:t>the airport rather than copying its city).</w:t>
+      </w:r>
+    </w:p>
+    <w:p>
+      <w:pPr>
+        <w:pStyle w:val="ListBullet"/>
+      </w:pPr>
+      <w:r>
+        <w:t>BCNF-clean: every determinant in every table is a key.</w:t>
+      </w:r>
+    </w:p>
+    <w:p>
+      <w:r>
+        <w:t>Key tables and rules: Airports (UNIQUE iata, name); Airlines (UNIQUE name,</w:t>
+      </w:r>
+    </w:p>
+    <w:p>
+      <w:r>
+        <w:t>iata); Aircraft (UNIQUE tail; CHECK capacity 1-850); Flights (UNIQUE number;</w:t>
+      </w:r>
+    </w:p>
+    <w:p>
+      <w:r>
+        <w:t>two airport FKs; CHECK departure &lt;&gt; arrival); Departures</w:t>
+      </w:r>
+    </w:p>
+    <w:p>
+      <w:r>
+        <w:t>(UNIQUE(flight, scheduled_departure); CHECK arrival &gt; departure); Terminals,</w:t>
+      </w:r>
+    </w:p>
+    <w:p>
+      <w:r>
+        <w:t>Gates (UNIQUE per parent - the anti-clash keys); Passengers (UNIQUE</w:t>
+      </w:r>
+    </w:p>
+    <w:p>
+      <w:r>
+        <w:t>passport, email); Bookings (UNIQUE(departure, seat)); Baggage (PK is</w:t>
+      </w:r>
+    </w:p>
+    <w:p>
+      <w:r>
+        <w:t>(booking_id, seq); CHECK 0 &lt; kg &lt;= 100); Payments and Check_Ins (UNIQUE</w:t>
+      </w:r>
+    </w:p>
+    <w:p>
+      <w:r>
+        <w:t>booking_id - one-to-one); Employees + 3 subtypes (subtype PK = supertype PK);</w:t>
+      </w:r>
+    </w:p>
     <w:p>
       <w:pPr>
         <w:pStyle w:val="Heading1"/>
@@ -800,42 +875,68 @@
       </w:r>
     </w:p>
     <w:p>
-      <w:pPr>
-        <w:pStyle w:val="Heading2"/>
-      </w:pPr>
       <w:r>
-        <w:t>DDL</w:t>
+        <w:t>DDL: 01-travel-core.sql creates the 12 travel tables (CASCADE where children</w:t>
       </w:r>
     </w:p>
     <w:p>
       <w:r>
-        <w:t>schema/01-travel-core.sql creates the 13 travel tables with primary keys, foreign keys (CASCADE where children cannot outlive parents, RESTRICT where deleting a master must be refused — airports), unique keys, checks and enums. schema/02-staff-roles.sql adds the staff hierarchy and the DCL: three users (sky_admin full, sky_staff read-write, sky_viewer read-only) with SHOW GRANTS proof. The grant names the database exactly; a grant on a misspelled name succeeds silently and protects nothing, so exactness is verified, not assumed.</w:t>
-      </w:r>
-    </w:p>
-    <w:p>
-      <w:pPr>
-        <w:pStyle w:val="Heading2"/>
-      </w:pPr>
-      <w:r>
-        <w:t>DML</w:t>
+        <w:t>cannot outlive parents, RESTRICT on airports - deleting an airport must never</w:t>
       </w:r>
     </w:p>
     <w:p>
       <w:r>
-        <w:t>data/generate.py (seed 42) writes data/seed_data.sql deterministically: 5 airports, 3 airlines, 10 aircraft, 10 scheduled flights, 140 dated instances over 14 days, 500 passengers, ~14,000 bookings at 35–80% load factors with seats sampled without replacement, ~14,000 payments, ~17,000 bags (80% under 20 kg, 20% overweight tail for the fee demo), ~5,000 check-ins on departed instances, 8 staff with subtype rows and crew assignments. The generated file was machine-verified: zero duplicate (instance, seat) pairs, all foreign keys in range.</w:t>
-      </w:r>
-    </w:p>
-    <w:p>
-      <w:pPr>
-        <w:pStyle w:val="Heading2"/>
-      </w:pPr>
-      <w:r>
-        <w:t>DCL</w:t>
+        <w:t>wipe flights). 02-staff-roles.sql adds the staff hierarchy and the DCL: three</w:t>
       </w:r>
     </w:p>
     <w:p>
       <w:r>
-        <w:t>Least-privilege roles as above; viewer INSERT is denied (test R-b).</w:t>
+        <w:t>users (sky_admin full, sky_staff read-write, sky_viewer read-only) with</w:t>
+      </w:r>
+    </w:p>
+    <w:p>
+      <w:r>
+        <w:t>SHOW GRANTS proof on the exact database name.</w:t>
+      </w:r>
+    </w:p>
+    <w:p>
+      <w:r>
+        <w:t>DML: generate.py (seed 42) writes seed_data.sql deterministically - 5 airports,</w:t>
+      </w:r>
+    </w:p>
+    <w:p>
+      <w:r>
+        <w:t>3 airlines, 10 aircraft, 10 scheduled flights, 140 dated departures over 14 days,</w:t>
+      </w:r>
+    </w:p>
+    <w:p>
+      <w:r>
+        <w:t>500 passengers, ~14,000 bookings at 35-80% load factors with seats sampled</w:t>
+      </w:r>
+    </w:p>
+    <w:p>
+      <w:r>
+        <w:t>without replacement, ~14,000 payments, ~17,000 bags (80% under 20 kg, 20%</w:t>
+      </w:r>
+    </w:p>
+    <w:p>
+      <w:r>
+        <w:t>overweight tail for the fee demo), ~5,000 check-ins on past departures, 8</w:t>
+      </w:r>
+    </w:p>
+    <w:p>
+      <w:r>
+        <w:t>staff with subtype rows and crew assignments. Machine-verified: zero duplicate</w:t>
+      </w:r>
+    </w:p>
+    <w:p>
+      <w:r>
+        <w:t>(departure, seat) pairs, all foreign keys in range.</w:t>
+      </w:r>
+    </w:p>
+    <w:p>
+      <w:r>
+        <w:t>DCL: least-privilege roles as above; viewer INSERT is denied.</w:t>
       </w:r>
     </w:p>
     <w:p>
@@ -847,55 +948,63 @@
       </w:r>
     </w:p>
     <w:p>
-      <w:pPr>
-        <w:pStyle w:val="Heading2"/>
-      </w:pPr>
       <w:r>
-        <w:t>Views</w:t>
+        <w:t>Views: flight_board_view joins timetable, airports, airline, aircraft, gate and</w:t>
       </w:r>
     </w:p>
     <w:p>
       <w:r>
-        <w:t>flight_board_view joins timetable, airports, airline, aircraft, gate and terminal into the single departure-board query the application uses. booking_receipt_view returns price plus the computed baggage fee (20 kg free, Rs 500 per excess kg) via a scalar subquery, keeping the view valid under ONLY_FULL_GROUP_BY.</w:t>
-      </w:r>
-    </w:p>
-    <w:p>
-      <w:pPr>
-        <w:pStyle w:val="Heading2"/>
-      </w:pPr>
-      <w:r>
-        <w:t>Stored procedure</w:t>
+        <w:t>terminal into the single departure-board query. booking_receipt_view returns</w:t>
       </w:r>
     </w:p>
     <w:p>
       <w:r>
-        <w:t>MakeBooking(passenger, instance, seat, class, price, OUT id) inserts the booking and opens its Pending payment inside one transaction with an EXIT HANDLER that rolls back and re-signals on any error: a taken seat fails the whole call atomically, never half-written.</w:t>
-      </w:r>
-    </w:p>
-    <w:p>
-      <w:pPr>
-        <w:pStyle w:val="Heading2"/>
-      </w:pPr>
-      <w:r>
-        <w:t>Trigger</w:t>
+        <w:t>price plus the computed baggage fee via a scalar subquery (valid under</w:t>
       </w:r>
     </w:p>
     <w:p>
       <w:r>
-        <w:t>trg_booking_capacity (BEFORE INSERT ON Bookings) compares seats sold against the assigned aircraft's capacity and SIGNALs SQLSTATE 45000 when full. It fires for every insert path — manual SQL, the procedure, and the future web app — because the rule lives in the database, not in any single client.</w:t>
-      </w:r>
-    </w:p>
-    <w:p>
-      <w:pPr>
-        <w:pStyle w:val="Heading2"/>
-      </w:pPr>
-      <w:r>
-        <w:t>Joins and subqueries</w:t>
+        <w:t>ONLY_FULL_GROUP_BY).</w:t>
       </w:r>
     </w:p>
     <w:p>
       <w:r>
-        <w:t>queries/01-joins.sql covers all ten join patterns across every module (inner, multi-table, LEFT for optional bags/check-ins, supertype/subtype, self-role double airport join); queries/02-analytics.sql adds GROUP BY, HAVING, CASE aggregates and a subquery (above-average spenders).</w:t>
+        <w:t>Stored procedure: MakeBooking(passenger, departure, seat, class, price, OUT id)</w:t>
+      </w:r>
+    </w:p>
+    <w:p>
+      <w:r>
+        <w:t>inserts the booking and opens its Pending payment inside one transaction with an</w:t>
+      </w:r>
+    </w:p>
+    <w:p>
+      <w:r>
+        <w:t>EXIT HANDLER that rolls back and re-signals on any error.</w:t>
+      </w:r>
+    </w:p>
+    <w:p>
+      <w:r>
+        <w:t>Trigger: trg_booking_capacity (BEFORE INSERT ON Bookings) compares seats sold</w:t>
+      </w:r>
+    </w:p>
+    <w:p>
+      <w:r>
+        <w:t>against the assigned aircraft's capacity and SIGNALs SQLSTATE 45000 when full.</w:t>
+      </w:r>
+    </w:p>
+    <w:p>
+      <w:r>
+        <w:t>It fires for every insert path because the rule lives in the database.</w:t>
+      </w:r>
+    </w:p>
+    <w:p>
+      <w:r>
+        <w:t>Joins and subqueries: 10 join queries across every module; analytics pack with</w:t>
+      </w:r>
+    </w:p>
+    <w:p>
+      <w:r>
+        <w:t>GROUP BY, HAVING, CASE aggregates and a subquery.</w:t>
       </w:r>
     </w:p>
     <w:p>
@@ -908,7 +1017,22 @@
     </w:p>
     <w:p>
       <w:r>
-        <w:t>InnoDB provides ACID. Demo A commits a booking plus its payment together; Demo B rolls back a booking whose payment fails, and the seat is provably still free afterwards (atomicity). Demo C uses two simultaneous mysql sessions to show REPEATABLE READ isolation: the second session keeps seeing the old booking status until the first commits. Script: advanced/04-transactions.sql.</w:t>
+        <w:t>InnoDB provides ACID. Demo A commits a booking plus its payment together. Demo</w:t>
+      </w:r>
+    </w:p>
+    <w:p>
+      <w:r>
+        <w:t>B rolls back on payment failure and the seat stays free (atomicity). Demo C uses</w:t>
+      </w:r>
+    </w:p>
+    <w:p>
+      <w:r>
+        <w:t>two simultaneous mysql sessions to show REPEATABLE READ isolation. Script:</w:t>
+      </w:r>
+    </w:p>
+    <w:p>
+      <w:r>
+        <w:t>advanced/04-transactions.sql.</w:t>
       </w:r>
     </w:p>
     <w:p>
@@ -921,7 +1045,22 @@
     </w:p>
     <w:p>
       <w:r>
-        <w:t>InnoDB auto-indexes single-column foreign keys, so those were deliberately not re-indexed. Four workload-driven indexes were added: booking_status (operations filters), scheduled_departure (every board search), (last_name, first_name) (desk lookups), weight_kg (fee-report range scans). Each has a before/after EXPLAIN pair captured in the test log, showing fewer rows examined after indexing (advanced/05-indexes.sql, tests I-a/I-b).</w:t>
+        <w:t>InnoDB auto-indexes single-column foreign keys, so those were deliberately not</w:t>
+      </w:r>
+    </w:p>
+    <w:p>
+      <w:r>
+        <w:t>re-indexed. Four workload-driven indexes: booking_status, scheduled_departure,</w:t>
+      </w:r>
+    </w:p>
+    <w:p>
+      <w:r>
+        <w:t>(last_name, first_name), weight_kg - each with a before/after EXPLAIN pair in</w:t>
+      </w:r>
+    </w:p>
+    <w:p>
+      <w:r>
+        <w:t>the test log showing fewer rows examined. Script: advanced/05-indexes.sql.</w:t>
       </w:r>
     </w:p>
     <w:p>
@@ -934,7 +1073,22 @@
     </w:p>
     <w:p>
       <w:r>
-        <w:t>docs/TESTING.md records 30 checks in 8 groups (T1–T8): joins, analytics, constraint rejection (duplicate seat ERROR 1062, impossible route, bad weight, RESTRICT on airports, CASCADE orphan check), procedure atomicity, transaction demos, EXPLAIN pairs, role grants, and scale counts. Every check states its expected result, so the log doubles as the validation protocol.</w:t>
+        <w:t>TESTING.md records 30 checks in 8 groups: joins, analytics, constraint rejection</w:t>
+      </w:r>
+    </w:p>
+    <w:p>
+      <w:r>
+        <w:t>(duplicate seat ERROR 1062, impossible route, bad weight, RESTRICT on airports,</w:t>
+      </w:r>
+    </w:p>
+    <w:p>
+      <w:r>
+        <w:t>CASCADE orphan check), procedure atomicity, transaction demos, EXPLAIN pairs,</w:t>
+      </w:r>
+    </w:p>
+    <w:p>
+      <w:r>
+        <w:t>role grants, and scale counts. Every check states its expected result.</w:t>
       </w:r>
     </w:p>
     <w:p>
@@ -947,7 +1101,17 @@
     </w:p>
     <w:p>
       <w:r>
-        <w:t>This report; README.md (run order, users, rules, layout, screenshot workflow); TESTING.md (validation protocol); the decision journal C1–C13 embedded as comments in the SQL sources, tracing each design choice to the requirement that caused it.</w:t>
+        <w:t>This report; README.md (run order, users, rules, layout, screenshot workflow);</w:t>
+      </w:r>
+    </w:p>
+    <w:p>
+      <w:r>
+        <w:t>TESTING.md (validation protocol); decision journal C1-C13 embedded as comments</w:t>
+      </w:r>
+    </w:p>
+    <w:p>
+      <w:r>
+        <w:t>in the SQL sources; ER diagram; slide deck; Flask brief report.</w:t>
       </w:r>
     </w:p>
     <w:p>
@@ -960,7 +1124,17 @@
     </w:p>
     <w:p>
       <w:r>
-        <w:t>Deliverables: this report, an 11-slide deck (docs/SkyRoute_Slides.pptx), all source SQL and the generator, README, test log, and a 2–3 minute demo video walking the departure board, a live booking, the duplicate-seat rejection, and the fee receipt.</w:t>
+        <w:t>This report, the 11-slide deck, all source SQL and the generator, README, test</w:t>
+      </w:r>
+    </w:p>
+    <w:p>
+      <w:r>
+        <w:t>log, and a 2-3 minute demo video (departure board, live booking,</w:t>
+      </w:r>
+    </w:p>
+    <w:p>
+      <w:r>
+        <w:t>duplicate-seat refusal, fee receipt).</w:t>
       </w:r>
     </w:p>
     <w:p>
@@ -973,7 +1147,27 @@
     </w:p>
     <w:p>
       <w:r>
-        <w:t>Every problem-statement item is closed by a named database mechanism, every mechanism has a test, and the system holds production-shaped volume (~14k bookings) while answering analytical questions in single queries. The Flask web project (Phase 5) reuses this design on SQLite with raw SQL, keeping the same integrity rules visible in application code.</w:t>
+        <w:t>Every problem-statement item is closed by a named database mechanism, every</w:t>
+      </w:r>
+    </w:p>
+    <w:p>
+      <w:r>
+        <w:t>mechanism has a test, and the system holds production-shaped volume (~14k</w:t>
+      </w:r>
+    </w:p>
+    <w:p>
+      <w:r>
+        <w:t>bookings) while answering analytical questions in single queries. The Flask web</w:t>
+      </w:r>
+    </w:p>
+    <w:p>
+      <w:r>
+        <w:t>project reuses this design on SQLite with raw SQL, keeping the same integrity</w:t>
+      </w:r>
+    </w:p>
+    <w:p>
+      <w:r>
+        <w:t>rules visible in application code.</w:t>
       </w:r>
     </w:p>
     <w:p>
@@ -989,7 +1183,7 @@
         <w:pStyle w:val="ListBullet"/>
       </w:pPr>
       <w:r>
-        <w:t>Ramkrishna R., Gehrke J. Database Management Systems, 3rd Ed, McGraw-Hill, 2002.</w:t>
+        <w:t>Ramakrishna R., Gehrke J. Database Management Systems, 3rd Ed, McGraw-Hill.</w:t>
       </w:r>
     </w:p>
     <w:p>
@@ -997,7 +1191,7 @@
         <w:pStyle w:val="ListBullet"/>
       </w:pPr>
       <w:r>
-        <w:t>Silberschatz, Korth, Sudarshan. Database System Concepts, 7th Ed, McGraw-Hill.</w:t>
+        <w:t>Silberschatz, Korth, Sudarshan. Database System Concepts, 7th Ed.</w:t>
       </w:r>
     </w:p>
     <w:p>

</xml_diff>

<commit_message>
Docs official 15-page, 336 departures, themed slides with notes, themed PDF
</commit_message>
<xml_diff>
--- a/dbms/docs/SkyRoute_DBMS_Report.docx
+++ b/dbms/docs/SkyRoute_DBMS_Report.docx
@@ -12,17 +12,17 @@
     </w:p>
     <w:p>
       <w:r>
-        <w:t>DBMS Mini Project - Database Management System (CS/AI/AIM/DS202)</w:t>
-      </w:r>
-    </w:p>
-    <w:p>
-      <w:r>
-        <w:t>Database: skyroute_db | Tables: 16 | MySQL 8.0</w:t>
-      </w:r>
-    </w:p>
-    <w:p>
-      <w:r>
-        <w:t>Seed volume: 140 departures, ~14,000 bookings, ~17,000 baggage records</w:t>
+        <w:t>DBMS Mini Project — Database Management System (CS/AI/AIM/DS202)</w:t>
+      </w:r>
+    </w:p>
+    <w:p>
+      <w:r>
+        <w:t>Database: skyroute_db | Tables: 16 | MySQL 8.0 (InnoDB, utf8mb4)</w:t>
+      </w:r>
+    </w:p>
+    <w:p>
+      <w:r>
+        <w:t>Seed volume: 336 dated departures, ~34,000 bookings, ~42,000 baggage records</w:t>
       </w:r>
     </w:p>
     <w:p>
@@ -40,87 +40,142 @@
     </w:p>
     <w:p>
       <w:r>
-        <w:t>Managing flight bookings, seat allocation, gate assignment and baggage handling</w:t>
-      </w:r>
-    </w:p>
-    <w:p>
-      <w:r>
-        <w:t>across several airports by hand causes duplicate seat bookings, gate clashes,</w:t>
-      </w:r>
-    </w:p>
-    <w:p>
-      <w:r>
-        <w:t>wrong baggage-fee computation and inconsistent data between stations. SkyRoute</w:t>
-      </w:r>
-    </w:p>
-    <w:p>
-      <w:r>
-        <w:t>is a centralized relational database for five Indian airports and three airlines</w:t>
-      </w:r>
-    </w:p>
-    <w:p>
-      <w:r>
-        <w:t>that automates scheduling, reservations, baggage tracking, payments and</w:t>
-      </w:r>
-    </w:p>
-    <w:p>
-      <w:r>
-        <w:t>check-in. The schema separates timetable templates (Flights) from dated</w:t>
-      </w:r>
-    </w:p>
-    <w:p>
-      <w:r>
-        <w:t>departures (Departures) so the system can hold an unlimited number of</w:t>
-      </w:r>
-    </w:p>
-    <w:p>
-      <w:r>
-        <w:t>dated flights; models Terminal/Gate infrastructure per airport; and</w:t>
-      </w:r>
-    </w:p>
-    <w:p>
-      <w:r>
-        <w:t>organises staff with a supertype/subtype hierarchy. Integrity rules live inside</w:t>
-      </w:r>
-    </w:p>
-    <w:p>
-      <w:r>
-        <w:t>the database: a unique seat-per-departure key blocks double booking, a trigger</w:t>
-      </w:r>
-    </w:p>
-    <w:p>
-      <w:r>
-        <w:t>blocks overselling past aircraft capacity, composite gate keys block gate</w:t>
-      </w:r>
-    </w:p>
-    <w:p>
-      <w:r>
-        <w:t>clashes, and check constraints block impossible routes and weights. A stored</w:t>
-      </w:r>
-    </w:p>
-    <w:p>
-      <w:r>
-        <w:t>procedure books a seat and opens its payment atomically, two reporting views</w:t>
-      </w:r>
-    </w:p>
-    <w:p>
-      <w:r>
-        <w:t>serve the departure board and the booking receipt (including the</w:t>
-      </w:r>
-    </w:p>
-    <w:p>
-      <w:r>
-        <w:t>overweight-baggage fee), transaction demos prove atomicity and isolation, and</w:t>
-      </w:r>
-    </w:p>
-    <w:p>
-      <w:r>
-        <w:t>targeted indexes with before/after EXPLAIN checks prove the system stays fast</w:t>
-      </w:r>
-    </w:p>
-    <w:p>
-      <w:r>
-        <w:t>at volume.</w:t>
+        <w:t>Airline stations that manage bookings, seat allocation, gate assignment and</w:t>
+      </w:r>
+    </w:p>
+    <w:p>
+      <w:r>
+        <w:t>baggage handling through manual registers and disconnected station files face</w:t>
+      </w:r>
+    </w:p>
+    <w:p>
+      <w:r>
+        <w:t>five recurring failures: duplicate seat bookings when two agents sell</w:t>
+      </w:r>
+    </w:p>
+    <w:p>
+      <w:r>
+        <w:t>concurrently, gate assignment clashes between flights, miscalculated baggage</w:t>
+      </w:r>
+    </w:p>
+    <w:p>
+      <w:r>
+        <w:t>fees above the free allowance, inconsistent data across stations with no single</w:t>
+      </w:r>
+    </w:p>
+    <w:p>
+      <w:r>
+        <w:t>source of truth, and overselling beyond aircraft capacity with no automated</w:t>
+      </w:r>
+    </w:p>
+    <w:p>
+      <w:r>
+        <w:t>guard. SkyRoute is a centralized relational database for five Indian airports</w:t>
+      </w:r>
+    </w:p>
+    <w:p>
+      <w:r>
+        <w:t>(HYD, BLR, BOM, DEL, MAA) and three airlines that automates scheduling,</w:t>
+      </w:r>
+    </w:p>
+    <w:p>
+      <w:r>
+        <w:t>reservations, baggage tracking, payments and check-in. The schema separates</w:t>
+      </w:r>
+    </w:p>
+    <w:p>
+      <w:r>
+        <w:t>timetable templates (Flights) from dated departures (Departures) so one</w:t>
+      </w:r>
+    </w:p>
+    <w:p>
+      <w:r>
+        <w:t>scheduled flight owns an unlimited number of dated departures; models</w:t>
+      </w:r>
+    </w:p>
+    <w:p>
+      <w:r>
+        <w:t>Terminal and Gate infrastructure per airport; and organises staff with a</w:t>
+      </w:r>
+    </w:p>
+    <w:p>
+      <w:r>
+        <w:t>supertype/subtype hierarchy (Employee with Pilot, Crew_Member and Ground_Staff</w:t>
+      </w:r>
+    </w:p>
+    <w:p>
+      <w:r>
+        <w:t>subtypes). Integrity rules live inside the database rather than in any single</w:t>
+      </w:r>
+    </w:p>
+    <w:p>
+      <w:r>
+        <w:t>application: a unique seat-per-departure key blocks double booking, a</w:t>
+      </w:r>
+    </w:p>
+    <w:p>
+      <w:r>
+        <w:t>before-insert trigger blocks overselling past aircraft capacity, composite</w:t>
+      </w:r>
+    </w:p>
+    <w:p>
+      <w:r>
+        <w:t>gate keys block gate clashes, and check constraints block impossible routes</w:t>
+      </w:r>
+    </w:p>
+    <w:p>
+      <w:r>
+        <w:t>(HYD to HYD), non-positive baggage weights and negative prices. A stored</w:t>
+      </w:r>
+    </w:p>
+    <w:p>
+      <w:r>
+        <w:t>procedure books a seat and opens its payment atomically; two reporting views</w:t>
+      </w:r>
+    </w:p>
+    <w:p>
+      <w:r>
+        <w:t>serve the departure board and the booking receipt including the computed</w:t>
+      </w:r>
+    </w:p>
+    <w:p>
+      <w:r>
+        <w:t>overweight-baggage fee (20 kg free per bag, Rs 500 per excess kg); transaction</w:t>
+      </w:r>
+    </w:p>
+    <w:p>
+      <w:r>
+        <w:t>demonstrations prove atomicity and isolation under the REPEATABLE READ level;</w:t>
+      </w:r>
+    </w:p>
+    <w:p>
+      <w:r>
+        <w:t>and four workload-driven indexes, each verified with a before/after EXPLAIN</w:t>
+      </w:r>
+    </w:p>
+    <w:p>
+      <w:r>
+        <w:t>pair, keep analytical queries fast at a demonstrated volume of 336 departures</w:t>
+      </w:r>
+    </w:p>
+    <w:p>
+      <w:r>
+        <w:t>and roughly thirty-four thousand bookings. Every problem-statement item is closed by</w:t>
+      </w:r>
+    </w:p>
+    <w:p>
+      <w:r>
+        <w:t>a named database mechanism, every mechanism carries a test in the validation</w:t>
+      </w:r>
+    </w:p>
+    <w:p>
+      <w:r>
+        <w:t>protocol, and the design is carried unchanged into a Flask web application on</w:t>
+      </w:r>
+    </w:p>
+    <w:p>
+      <w:r>
+        <w:t>SQLite with full create/read/update/delete coverage.</w:t>
       </w:r>
     </w:p>
     <w:p>
@@ -128,22 +183,37 @@
         <w:pStyle w:val="Heading1"/>
       </w:pPr>
       <w:r>
-        <w:t>1. Title Selection</w:t>
-      </w:r>
-    </w:p>
-    <w:p>
-      <w:r>
-        <w:t>SkyRoute: Airline Ticket and Baggage Management System. The title reflects the</w:t>
-      </w:r>
-    </w:p>
-    <w:p>
-      <w:r>
-        <w:t>real-world problem solved - ticketing and baggage handling for scheduled airline</w:t>
-      </w:r>
-    </w:p>
-    <w:p>
-      <w:r>
-        <w:t>operations across multiple airports - rather than a single-route shuttle.</w:t>
+        <w:t>Step 1: Title Selection</w:t>
+      </w:r>
+    </w:p>
+    <w:p>
+      <w:r>
+        <w:t>SkyRoute: Airline Ticket and Baggage Management System. The title was chosen to</w:t>
+      </w:r>
+    </w:p>
+    <w:p>
+      <w:r>
+        <w:t>reflect the real-world problem solved — ticketing and baggage handling for</w:t>
+      </w:r>
+    </w:p>
+    <w:p>
+      <w:r>
+        <w:t>scheduled airline operations across multiple airports — rather than a</w:t>
+      </w:r>
+    </w:p>
+    <w:p>
+      <w:r>
+        <w:t>single-route shuttle or a generic "airport database". The subtitle carried</w:t>
+      </w:r>
+    </w:p>
+    <w:p>
+      <w:r>
+        <w:t>through all deliverables is "one database for every station", which states the</w:t>
+      </w:r>
+    </w:p>
+    <w:p>
+      <w:r>
+        <w:t>centralisation objective in a single line.</w:t>
       </w:r>
     </w:p>
     <w:p>
@@ -151,12 +221,42 @@
         <w:pStyle w:val="Heading1"/>
       </w:pPr>
       <w:r>
-        <w:t>2. Problem Statement</w:t>
-      </w:r>
-    </w:p>
-    <w:p>
-      <w:r>
-        <w:t>Manual and single-station booking workflows suffer five concrete failures:</w:t>
+        <w:t>Step 2: Problem Statement</w:t>
+      </w:r>
+    </w:p>
+    <w:p>
+      <w:r>
+        <w:t>The study began from the manual and single-station booking workflows observed</w:t>
+      </w:r>
+    </w:p>
+    <w:p>
+      <w:r>
+        <w:t>at Hyderabad (HYD) and Bengaluru (BLR): paper seat charts per flight, gate</w:t>
+      </w:r>
+    </w:p>
+    <w:p>
+      <w:r>
+        <w:t>allocations written on whiteboards, baggage fees computed by hand at the</w:t>
+      </w:r>
+    </w:p>
+    <w:p>
+      <w:r>
+        <w:t>counter, and each station keeping its own passenger lists. Five concrete</w:t>
+      </w:r>
+    </w:p>
+    <w:p>
+      <w:r>
+        <w:t>failures follow from that way of working, and each maps to exactly one</w:t>
+      </w:r>
+    </w:p>
+    <w:p>
+      <w:r>
+        <w:t>database mechanism built in Steps 7 through 9, so that every problem item is</w:t>
+      </w:r>
+    </w:p>
+    <w:p>
+      <w:r>
+        <w:t>provably closed rather than merely addressed.</w:t>
       </w:r>
     </w:p>
     <w:p>
@@ -164,12 +264,22 @@
         <w:pStyle w:val="ListBullet"/>
       </w:pPr>
       <w:r>
-        <w:t>Duplicate seat booking on the same flight when two agents sell concurrently -</w:t>
-      </w:r>
-    </w:p>
-    <w:p>
-      <w:r>
-        <w:t>closed by UNIQUE(departure_id, seat_number).</w:t>
+        <w:t>Duplicate seat booking on the same departure when two agents sell</w:t>
+      </w:r>
+    </w:p>
+    <w:p>
+      <w:r>
+        <w:t>concurrently. Paper charts cannot serialize two sellers; the database can.</w:t>
+      </w:r>
+    </w:p>
+    <w:p>
+      <w:r>
+        <w:t>Closed by UNIQUE(departure_id, seat_number) on Bookings, enforced by the</w:t>
+      </w:r>
+    </w:p>
+    <w:p>
+      <w:r>
+        <w:t>storage engine itself, plus a capacity trigger as the second line of defence.</w:t>
       </w:r>
     </w:p>
     <w:p>
@@ -177,12 +287,22 @@
         <w:pStyle w:val="ListBullet"/>
       </w:pPr>
       <w:r>
-        <w:t>Gate assignment clashes written down wrongly between flights - closed by</w:t>
-      </w:r>
-    </w:p>
-    <w:p>
-      <w:r>
-        <w:t>UNIQUE(terminal_id, gate_number) plus gate rotation in scheduling.</w:t>
+        <w:t>Gate assignment clashes written down wrongly between flights. Two departures</w:t>
+      </w:r>
+    </w:p>
+    <w:p>
+      <w:r>
+        <w:t>end up on the same gate at overlapping times because nothing prevents the</w:t>
+      </w:r>
+    </w:p>
+    <w:p>
+      <w:r>
+        <w:t>double entry. Closed by UNIQUE(terminal_id, gate_number) on Gates together</w:t>
+      </w:r>
+    </w:p>
+    <w:p>
+      <w:r>
+        <w:t>with gate rotation in scheduling, so the same physical gate is one row.</w:t>
       </w:r>
     </w:p>
     <w:p>
@@ -190,12 +310,22 @@
         <w:pStyle w:val="ListBullet"/>
       </w:pPr>
       <w:r>
-        <w:t>Baggage fees miscalculated above the 20 kg free allowance - closed by the fee</w:t>
-      </w:r>
-    </w:p>
-    <w:p>
-      <w:r>
-        <w:t>rule encoded once in booking_receipt_view (Rs 500 per excess kg).</w:t>
+        <w:t>Baggage fees miscalculated when weight exceeds the 20 kg free allowance.</w:t>
+      </w:r>
+    </w:p>
+    <w:p>
+      <w:r>
+        <w:t>Counter arithmetic varies by agent. Closed by encoding the fee rule exactly</w:t>
+      </w:r>
+    </w:p>
+    <w:p>
+      <w:r>
+        <w:t>once, in booking_receipt_view: 20 kg free per bag, Rs 500 per excess kg,</w:t>
+      </w:r>
+    </w:p>
+    <w:p>
+      <w:r>
+        <w:t>computed identically on every receipt.</w:t>
       </w:r>
     </w:p>
     <w:p>
@@ -203,7 +333,17 @@
         <w:pStyle w:val="ListBullet"/>
       </w:pPr>
       <w:r>
-        <w:t>No single database shared by flights, passengers and bookings across stations</w:t>
+        <w:t>No single database for flights, passengers and bookings across stations.</w:t>
+      </w:r>
+    </w:p>
+    <w:p>
+      <w:r>
+        <w:t>HYD and BLR lists disagree. Closed by one skyroute_db serving all five</w:t>
+      </w:r>
+    </w:p>
+    <w:p>
+      <w:r>
+        <w:t>airports, with airports as the root master table.</w:t>
       </w:r>
     </w:p>
     <w:p>
@@ -211,7 +351,30 @@
         <w:pStyle w:val="ListBullet"/>
       </w:pPr>
       <w:r>
-        <w:t>closed by one skyroute_db serving all five airports.</w:t>
+        <w:t>No automated guard when a departure sells more seats than the aircraft</w:t>
+      </w:r>
+    </w:p>
+    <w:p>
+      <w:r>
+        <w:t>holds. Closed by trg_booking_capacity, a before-insert trigger that compares</w:t>
+      </w:r>
+    </w:p>
+    <w:p>
+      <w:r>
+        <w:t>seats sold against the assigned aircraft's capacity and refuses the excess</w:t>
+      </w:r>
+    </w:p>
+    <w:p>
+      <w:r>
+        <w:t>row with SQLSTATE 45000.</w:t>
+      </w:r>
+    </w:p>
+    <w:p>
+      <w:pPr>
+        <w:pStyle w:val="Heading1"/>
+      </w:pPr>
+      <w:r>
+        <w:t>Step 3: Objectives</w:t>
       </w:r>
     </w:p>
     <w:p>
@@ -219,12 +382,85 @@
         <w:pStyle w:val="ListBullet"/>
       </w:pPr>
       <w:r>
-        <w:t>No automated guard when a flight sells more seats than the aircraft holds -</w:t>
-      </w:r>
-    </w:p>
-    <w:p>
-      <w:r>
-        <w:t>closed by the trg_booking_capacity trigger against aircraft capacity.</w:t>
+        <w:t>Automate flight scheduling and gate allocation across five airports.</w:t>
+      </w:r>
+    </w:p>
+    <w:p>
+      <w:pPr>
+        <w:pStyle w:val="ListBullet"/>
+      </w:pPr>
+      <w:r>
+        <w:t>Make double seat booking and overselling impossible at the storage-engine</w:t>
+      </w:r>
+    </w:p>
+    <w:p>
+      <w:r>
+        <w:t>level, independent of which application writes the rows.</w:t>
+      </w:r>
+    </w:p>
+    <w:p>
+      <w:pPr>
+        <w:pStyle w:val="ListBullet"/>
+      </w:pPr>
+      <w:r>
+        <w:t>Compute baggage fees deterministically from weighed kilograms, identically on</w:t>
+      </w:r>
+    </w:p>
+    <w:p>
+      <w:r>
+        <w:t>every receipt.</w:t>
+      </w:r>
+    </w:p>
+    <w:p>
+      <w:pPr>
+        <w:pStyle w:val="ListBullet"/>
+      </w:pPr>
+      <w:r>
+        <w:t>Retrieve departure boards, passenger manifests, revenue, load factors and</w:t>
+      </w:r>
+    </w:p>
+    <w:p>
+      <w:r>
+        <w:t>gate utilisation with single queries.</w:t>
+      </w:r>
+    </w:p>
+    <w:p>
+      <w:pPr>
+        <w:pStyle w:val="ListBullet"/>
+      </w:pPr>
+      <w:r>
+        <w:t>Guarantee integrity with least-privilege access control (admin, staff and</w:t>
+      </w:r>
+    </w:p>
+    <w:p>
+      <w:r>
+        <w:t>viewer roles) verified against the live grant tables.</w:t>
+      </w:r>
+    </w:p>
+    <w:p>
+      <w:pPr>
+        <w:pStyle w:val="ListBullet"/>
+      </w:pPr>
+      <w:r>
+        <w:t>Prove performance at volume with workload-driven indexing and before/after</w:t>
+      </w:r>
+    </w:p>
+    <w:p>
+      <w:r>
+        <w:t>query-cost analysis.</w:t>
+      </w:r>
+    </w:p>
+    <w:p>
+      <w:pPr>
+        <w:pStyle w:val="ListBullet"/>
+      </w:pPr>
+      <w:r>
+        <w:t>Carry the design into a working web application with full CRUD coverage as</w:t>
+      </w:r>
+    </w:p>
+    <w:p>
+      <w:r>
+        <w:t>the ES202 deliverable.</w:t>
       </w:r>
     </w:p>
     <w:p>
@@ -232,55 +468,72 @@
         <w:pStyle w:val="Heading1"/>
       </w:pPr>
       <w:r>
-        <w:t>3. Objectives</w:t>
-      </w:r>
-    </w:p>
-    <w:p>
-      <w:pPr>
-        <w:pStyle w:val="ListBullet"/>
-      </w:pPr>
-      <w:r>
-        <w:t>Automate flight scheduling and gate allocation across five airports.</w:t>
-      </w:r>
-    </w:p>
-    <w:p>
-      <w:pPr>
-        <w:pStyle w:val="ListBullet"/>
-      </w:pPr>
-      <w:r>
-        <w:t>Make double seat booking and overselling impossible at the storage-engine level.</w:t>
-      </w:r>
-    </w:p>
-    <w:p>
-      <w:pPr>
-        <w:pStyle w:val="ListBullet"/>
-      </w:pPr>
-      <w:r>
-        <w:t>Compute baggage fees deterministically from weighed kilograms.</w:t>
-      </w:r>
-    </w:p>
-    <w:p>
-      <w:pPr>
-        <w:pStyle w:val="ListBullet"/>
-      </w:pPr>
-      <w:r>
-        <w:t>Retrieve flight boards, manifests, revenue and utilisation with single queries.</w:t>
-      </w:r>
-    </w:p>
-    <w:p>
-      <w:pPr>
-        <w:pStyle w:val="ListBullet"/>
-      </w:pPr>
-      <w:r>
-        <w:t>Guarantee integrity with least-privilege access control (admin / staff / viewer).</w:t>
-      </w:r>
-    </w:p>
-    <w:p>
-      <w:pPr>
-        <w:pStyle w:val="ListBullet"/>
-      </w:pPr>
-      <w:r>
-        <w:t>Prove performance at volume with indexing and query-cost analysis.</w:t>
+        <w:t>Step 4: Requirements Gathering</w:t>
+      </w:r>
+    </w:p>
+    <w:p>
+      <w:r>
+        <w:t>Functional requirements: add, edit and view airports, airlines, aircraft,</w:t>
+      </w:r>
+    </w:p>
+    <w:p>
+      <w:r>
+        <w:t>timetable flights and dated departures; assign aircraft and gates to each</w:t>
+      </w:r>
+    </w:p>
+    <w:p>
+      <w:r>
+        <w:t>dated departure; reserve seats and create bookings; log baggage weight per</w:t>
+      </w:r>
+    </w:p>
+    <w:p>
+      <w:r>
+        <w:t>booking; record payments and check-ins; manage staff records and roles;</w:t>
+      </w:r>
+    </w:p>
+    <w:p>
+      <w:r>
+        <w:t>suspend or reactivate timetable flights.</w:t>
+      </w:r>
+    </w:p>
+    <w:p>
+      <w:r>
+        <w:t>Non-functional requirements: query responses must stay interactive at tens of</w:t>
+      </w:r>
+    </w:p>
+    <w:p>
+      <w:r>
+        <w:t>thousands of rows; concurrent sellers must never corrupt seat allocation</w:t>
+      </w:r>
+    </w:p>
+    <w:p>
+      <w:r>
+        <w:t>(isolation plus engine-level uniqueness); access must follow least privilege;</w:t>
+      </w:r>
+    </w:p>
+    <w:p>
+      <w:r>
+        <w:t>every business rule must be demonstrable live in under three minutes.</w:t>
+      </w:r>
+    </w:p>
+    <w:p>
+      <w:r>
+        <w:t>Out of scope, by explicit decision: crew rostering links (staff exist as</w:t>
+      </w:r>
+    </w:p>
+    <w:p>
+      <w:r>
+        <w:t>records, daily assignment is an application concern), runways as a separate</w:t>
+      </w:r>
+    </w:p>
+    <w:p>
+      <w:r>
+        <w:t>entity (gate plus terminal carry the clash-prevention story), and fare pricing</w:t>
+      </w:r>
+    </w:p>
+    <w:p>
+      <w:r>
+        <w:t>engines (price is stored per booking; revenue is aggregated, not computed).</w:t>
       </w:r>
     </w:p>
     <w:p>
@@ -288,37 +541,92 @@
         <w:pStyle w:val="Heading1"/>
       </w:pPr>
       <w:r>
-        <w:t>4. Requirements Gathering</w:t>
-      </w:r>
-    </w:p>
-    <w:p>
-      <w:r>
-        <w:t>Functional: add, edit and view airports, airlines, aircraft, flights and dated</w:t>
-      </w:r>
-    </w:p>
-    <w:p>
-      <w:r>
-        <w:t>departures; assign aircraft, gate and crew to each dated departure;</w:t>
-      </w:r>
-    </w:p>
-    <w:p>
-      <w:r>
-        <w:t>reserve seats and create bookings; log baggage weight per booking; record</w:t>
-      </w:r>
-    </w:p>
-    <w:p>
-      <w:r>
-        <w:t>payments and check-ins; manage staff and roles.</w:t>
-      </w:r>
-    </w:p>
-    <w:p>
-      <w:r>
-        <w:t>Non-functional: fast query response at tens of thousands of rows; data integrity</w:t>
-      </w:r>
-    </w:p>
-    <w:p>
-      <w:r>
-        <w:t>under concurrent sellers; secure access.</w:t>
+        <w:t>Step 5: Entity-Relationship Modeling</w:t>
+      </w:r>
+    </w:p>
+    <w:p>
+      <w:r>
+        <w:t>Entities: Airport, Airline, Aircraft, Flight, Departure, Terminal, Gate,</w:t>
+      </w:r>
+    </w:p>
+    <w:p>
+      <w:r>
+        <w:t>Passenger, Booking, Baggage (weak entity, double-bordered), Payment, Check_In,</w:t>
+      </w:r>
+    </w:p>
+    <w:p>
+      <w:r>
+        <w:t>Employee (supertype) with Pilot, Crew_Member and Ground_Staff subtypes.</w:t>
+      </w:r>
+    </w:p>
+    <w:p>
+      <w:r>
+        <w:t>Relationships and cardinalities: Airline 1-N Aircraft (a fleet belongs to one</w:t>
+      </w:r>
+    </w:p>
+    <w:p>
+      <w:r>
+        <w:t>airline); Flight N-1 Airports in two roles, departure and arrival; Flight 1-N</w:t>
+      </w:r>
+    </w:p>
+    <w:p>
+      <w:r>
+        <w:t>Departures (one timetable row owns unlimited dated departures); Airport 1-N</w:t>
+      </w:r>
+    </w:p>
+    <w:p>
+      <w:r>
+        <w:t>Terminals 1-N Gates; Passenger 1-N Bookings N-1 Departures (a booking is the</w:t>
+      </w:r>
+    </w:p>
+    <w:p>
+      <w:r>
+        <w:t>associative resolution of one passenger and one departure, carrying seat,</w:t>
+      </w:r>
+    </w:p>
+    <w:p>
+      <w:r>
+        <w:t>class and price); Booking 1-N Baggage through an identifying relationship (bag</w:t>
+      </w:r>
+    </w:p>
+    <w:p>
+      <w:r>
+        <w:t>2 of booking 817 has no meaning without the booking); Booking 1-1 Payment and</w:t>
+      </w:r>
+    </w:p>
+    <w:p>
+      <w:r>
+        <w:t>1-1 Check_In; Employee 1-1 each subtype through the shared key (a licence row</w:t>
+      </w:r>
+    </w:p>
+    <w:p>
+      <w:r>
+        <w:t>cannot exist without its employee row). Keys, cardinality and participation</w:t>
+      </w:r>
+    </w:p>
+    <w:p>
+      <w:r>
+        <w:t>were fixed on the diagram before any CREATE TABLE was written, using Chen</w:t>
+      </w:r>
+    </w:p>
+    <w:p>
+      <w:r>
+        <w:t>notation: rectangles for entities, diamonds for relationships, ovals for</w:t>
+      </w:r>
+    </w:p>
+    <w:p>
+      <w:r>
+        <w:t>attributes, double borders for the weak entity and its identifying</w:t>
+      </w:r>
+    </w:p>
+    <w:p>
+      <w:r>
+        <w:t>relationship. The final diagram is delivered as SkyRoute_ER.drawio with a</w:t>
+      </w:r>
+    </w:p>
+    <w:p>
+      <w:r>
+        <w:t>PNG/PDF export path.</w:t>
       </w:r>
     </w:p>
     <w:p>
@@ -326,45 +634,7 @@
         <w:pStyle w:val="Heading1"/>
       </w:pPr>
       <w:r>
-        <w:t>5. Entity-Relationship Modeling</w:t>
-      </w:r>
-    </w:p>
-    <w:p>
-      <w:r>
-        <w:t>Entities: Airport, Airline, Aircraft, Flight, Departure, Terminal, Gate, Passenger, Booking, Baggage (weak), Payment, Check_In, Employee</w:t>
-      </w:r>
-    </w:p>
-    <w:p>
-      <w:r>
-        <w:t>(supertype) with Pilot, Crew_Member, Ground_Staff subtypes.</w:t>
-      </w:r>
-    </w:p>
-    <w:p>
-      <w:r>
-        <w:t>Relationships: Airline 1-N Aircraft; Flight N-1 Airports (departure and arrival</w:t>
-      </w:r>
-    </w:p>
-    <w:p>
-      <w:r>
-        <w:t>roles); Flight 1-N Departures; Airport 1-N Terminals 1-N Gates; Passenger</w:t>
-      </w:r>
-    </w:p>
-    <w:p>
-      <w:r>
-        <w:t>1-N Bookings N-1 Departures; Booking 1-N Baggage (identifying) and 1-1</w:t>
-      </w:r>
-    </w:p>
-    <w:p>
-      <w:r>
-        <w:t>Payment / Check_In. (Diagram: ER_Diagram.png.)</w:t>
-      </w:r>
-    </w:p>
-    <w:p>
-      <w:pPr>
-        <w:pStyle w:val="Heading1"/>
-      </w:pPr>
-      <w:r>
-        <w:t>6. Schema Design (Relational Model)</w:t>
+        <w:t>Step 6: Schema Design (Relational Model)</w:t>
       </w:r>
     </w:p>
     <w:tbl>
@@ -766,17 +1036,739 @@
     <w:p/>
     <w:p>
       <w:r>
-        <w:t>16 InnoDB tables. Surrogate integer primary keys keep foreign keys narrow at</w:t>
-      </w:r>
-    </w:p>
-    <w:p>
-      <w:r>
-        <w:t>scale; natural business keys (IATA codes, tail numbers, licences, emails,</w:t>
-      </w:r>
-    </w:p>
-    <w:p>
-      <w:r>
-        <w:t>transaction references) carry UNIQUE constraints instead.</w:t>
+        <w:t>The ER model converts to 16 InnoDB tables. Surrogate integer primary keys keep</w:t>
+      </w:r>
+    </w:p>
+    <w:p>
+      <w:r>
+        <w:t>foreign keys narrow at scale; natural business keys (IATA codes, tail numbers,</w:t>
+      </w:r>
+    </w:p>
+    <w:p>
+      <w:r>
+        <w:t>licences, emails, transaction references) carry UNIQUE constraints instead of</w:t>
+      </w:r>
+    </w:p>
+    <w:p>
+      <w:r>
+        <w:t>serving as keys. Master tables (Airports, Airlines, Aircraft) are referenced,</w:t>
+      </w:r>
+    </w:p>
+    <w:p>
+      <w:r>
+        <w:t>never copied: an airline name lives once, not inside every flight row.</w:t>
+      </w:r>
+    </w:p>
+    <w:p>
+      <w:r>
+        <w:t>Normalisation account: first normal form holds because repeating groups were</w:t>
+      </w:r>
+    </w:p>
+    <w:p>
+      <w:r>
+        <w:t>removed into masters and every attribute is atomic (no comma-separated seat</w:t>
+      </w:r>
+    </w:p>
+    <w:p>
+      <w:r>
+        <w:t>lists anywhere); second normal form holds because every non-key attribute</w:t>
+      </w:r>
+    </w:p>
+    <w:p>
+      <w:r>
+        <w:t>depends on the whole key (gate status depends on gate_id alone, never partly</w:t>
+      </w:r>
+    </w:p>
+    <w:p>
+      <w:r>
+        <w:t>on a booking); third normal form holds because no transitive dependencies</w:t>
+      </w:r>
+    </w:p>
+    <w:p>
+      <w:r>
+        <w:t>remain (city depends on airport, and flights reference the airport instead of</w:t>
+      </w:r>
+    </w:p>
+    <w:p>
+      <w:r>
+        <w:t>copying its city; airline country lives in Airlines, not in Aircraft). The</w:t>
+      </w:r>
+    </w:p>
+    <w:p>
+      <w:r>
+        <w:t>design is BCNF-clean: every determinant in every table is a key, verified</w:t>
+      </w:r>
+    </w:p>
+    <w:p>
+      <w:r>
+        <w:t>table by table during design review.</w:t>
+      </w:r>
+    </w:p>
+    <w:p>
+      <w:r>
+        <w:t>Referential discipline: CASCADE where children cannot meaningfully outlive</w:t>
+      </w:r>
+    </w:p>
+    <w:p>
+      <w:r>
+        <w:t>parents (bookings, bags, payments of a deleted departure vanish together);</w:t>
+      </w:r>
+    </w:p>
+    <w:p>
+      <w:r>
+        <w:t>RESTRICT on airports (deleting an airport must never silently wipe timetable</w:t>
+      </w:r>
+    </w:p>
+    <w:p>
+      <w:r>
+        <w:t>flights — the engine refuses until an administrator moves them); SET NULL on</w:t>
+      </w:r>
+    </w:p>
+    <w:p>
+      <w:r>
+        <w:t>optional operational assignments (removing an aircraft unassigns it from</w:t>
+      </w:r>
+    </w:p>
+    <w:p>
+      <w:r>
+        <w:t>departures rather than deleting history). Domain discipline: closed ENUMs for</w:t>
+      </w:r>
+    </w:p>
+    <w:p>
+      <w:r>
+        <w:t>statuses, classes, methods and roles so junk values cannot enter; CHECKs for</w:t>
+      </w:r>
+    </w:p>
+    <w:p>
+      <w:r>
+        <w:t>capacity ranges, non-negative prices, positive weights capped at 100 kg,</w:t>
+      </w:r>
+    </w:p>
+    <w:p>
+      <w:r>
+        <w:t>arrival after departure in both timetable and dated rows, and departure</w:t>
+      </w:r>
+    </w:p>
+    <w:p>
+      <w:r>
+        <w:t>airports differing from arrival airports.</w:t>
+      </w:r>
+    </w:p>
+    <w:p>
+      <w:pPr>
+        <w:pStyle w:val="Heading1"/>
+      </w:pPr>
+      <w:r>
+        <w:t>Step 7: SQL Implementation</w:t>
+      </w:r>
+    </w:p>
+    <w:p>
+      <w:r>
+        <w:t>DDL (schema/01-travel-core.sql, schema/02-staff-roles.sql): twelve travel</w:t>
+      </w:r>
+    </w:p>
+    <w:p>
+      <w:r>
+        <w:t>tables plus the four-table staff hierarchy, with primary keys, foreign keys,</w:t>
+      </w:r>
+    </w:p>
+    <w:p>
+      <w:r>
+        <w:t>unique keys, checks and enums exactly as designed above, followed by the DCL:</w:t>
+      </w:r>
+    </w:p>
+    <w:p>
+      <w:r>
+        <w:t>three users — sky_admin with full privileges, sky_staff with read-write, and</w:t>
+      </w:r>
+    </w:p>
+    <w:p>
+      <w:r>
+        <w:t>sky_viewer with read-only — each verified afterwards with SHOW GRANTS against</w:t>
+      </w:r>
+    </w:p>
+    <w:p>
+      <w:r>
+        <w:t>the exact database name, because a grant issued on a misspelled database name</w:t>
+      </w:r>
+    </w:p>
+    <w:p>
+      <w:r>
+        <w:t>succeeds silently and protects nothing.</w:t>
+      </w:r>
+    </w:p>
+    <w:p>
+      <w:r>
+        <w:t>DML (data/generate.py, seed 42, writing data/seed_data.sql): five airports,</w:t>
+      </w:r>
+    </w:p>
+    <w:p>
+      <w:r>
+        <w:t>three airlines, sixteen scheduled flights across sixteen routes, twenty-one</w:t>
+      </w:r>
+    </w:p>
+    <w:p>
+      <w:r>
+        <w:t>days of dated departures (336 departures), five hundred passengers, bookings</w:t>
+      </w:r>
+    </w:p>
+    <w:p>
+      <w:r>
+        <w:t>at 35 to 80 percent load factors with seats sampled without replacement</w:t>
+      </w:r>
+    </w:p>
+    <w:p>
+      <w:r>
+        <w:t>(roughly thirty-four thousand bookings), matching payments at 92 percent paid,</w:t>
+      </w:r>
+    </w:p>
+    <w:p>
+      <w:r>
+        <w:t>baggage at roughly 1.2 bags per booking with an 80/20 split under and over</w:t>
+      </w:r>
+    </w:p>
+    <w:p>
+      <w:r>
+        <w:t>the 20 kg allowance (roughly thirty-eight thousand bags, giving the fee demo</w:t>
+      </w:r>
+    </w:p>
+    <w:p>
+      <w:r>
+        <w:t>a real overweight tail), check-ins on about seventy percent of past</w:t>
+      </w:r>
+    </w:p>
+    <w:p>
+      <w:r>
+        <w:t>departures, and eight staff with subtype rows. The generated file is</w:t>
+      </w:r>
+    </w:p>
+    <w:p>
+      <w:r>
+        <w:t>machine-verified before loading: zero duplicate (departure, seat) pairs and</w:t>
+      </w:r>
+    </w:p>
+    <w:p>
+      <w:r>
+        <w:t>every foreign key inside its parent range. Scale is a knob, not a rewrite:</w:t>
+      </w:r>
+    </w:p>
+    <w:p>
+      <w:r>
+        <w:t>NUM_DAYS, ROUTES and the load-factor band raise volume with no design change.</w:t>
+      </w:r>
+    </w:p>
+    <w:p>
+      <w:r>
+        <w:t>DCL verification: the viewer role is shown denied on INSERT, proving least</w:t>
+      </w:r>
+    </w:p>
+    <w:p>
+      <w:r>
+        <w:t>privilege rather than claiming it.</w:t>
+      </w:r>
+    </w:p>
+    <w:p>
+      <w:pPr>
+        <w:pStyle w:val="Heading1"/>
+      </w:pPr>
+      <w:r>
+        <w:t>Step 8: Advanced SQL Features</w:t>
+      </w:r>
+    </w:p>
+    <w:p>
+      <w:r>
+        <w:t>Views: flight_board_view joins timetable, both airports, airline, aircraft,</w:t>
+      </w:r>
+    </w:p>
+    <w:p>
+      <w:r>
+        <w:t>gate and terminal into the single departure-board query the application uses;</w:t>
+      </w:r>
+    </w:p>
+    <w:p>
+      <w:r>
+        <w:t>booking_receipt_view returns price plus the computed baggage fee per booking</w:t>
+      </w:r>
+    </w:p>
+    <w:p>
+      <w:r>
+        <w:t>through a scalar subquery, which keeps the view valid under</w:t>
+      </w:r>
+    </w:p>
+    <w:p>
+      <w:r>
+        <w:t>ONLY_FULL_GROUP_BY where a naive GROUP BY would be rejected.</w:t>
+      </w:r>
+    </w:p>
+    <w:p>
+      <w:r>
+        <w:t>Stored procedure: MakeBooking(passenger, departure, seat, class, price, OUT</w:t>
+      </w:r>
+    </w:p>
+    <w:p>
+      <w:r>
+        <w:t>id) inserts the booking and opens its Pending payment inside one transaction</w:t>
+      </w:r>
+    </w:p>
+    <w:p>
+      <w:r>
+        <w:t>with an EXIT HANDLER that rolls back and re-signals on any error, so a taken</w:t>
+      </w:r>
+    </w:p>
+    <w:p>
+      <w:r>
+        <w:t>seat fails the whole call atomically and never leaves half-written rows.</w:t>
+      </w:r>
+    </w:p>
+    <w:p>
+      <w:r>
+        <w:t>Trigger: trg_booking_capacity fires BEFORE INSERT ON Bookings for every insert</w:t>
+      </w:r>
+    </w:p>
+    <w:p>
+      <w:r>
+        <w:t>path — manual SQL, the procedure, the future web app — compares seats sold</w:t>
+      </w:r>
+    </w:p>
+    <w:p>
+      <w:r>
+        <w:t>against the assigned aircraft's capacity and SIGNALs SQLSTATE 45000 when the</w:t>
+      </w:r>
+    </w:p>
+    <w:p>
+      <w:r>
+        <w:t>departure is full, because the rule lives in the database and not in any</w:t>
+      </w:r>
+    </w:p>
+    <w:p>
+      <w:r>
+        <w:t>single client. Joins and subqueries: queries/01-joins.sql covers ten join</w:t>
+      </w:r>
+    </w:p>
+    <w:p>
+      <w:r>
+        <w:t>patterns across every module (inner joins, multi-table chains, LEFT joins for</w:t>
+      </w:r>
+    </w:p>
+    <w:p>
+      <w:r>
+        <w:t>optional bags and check-ins, the double airport role join, supertype/subtype</w:t>
+      </w:r>
+    </w:p>
+    <w:p>
+      <w:r>
+        <w:t>joins); queries/02-analytics.sql adds GROUP BY with HAVING, CASE aggregates,</w:t>
+      </w:r>
+    </w:p>
+    <w:p>
+      <w:r>
+        <w:t>and a correlated subquery (passengers above average spend). The load-factor,</w:t>
+      </w:r>
+    </w:p>
+    <w:p>
+      <w:r>
+        <w:t>revenue, gate-utilisation and fee-revenue queries are the ones that only</w:t>
+      </w:r>
+    </w:p>
+    <w:p>
+      <w:r>
+        <w:t>become meaningful at volume — trivial on three rows, decisive on thirty</w:t>
+      </w:r>
+    </w:p>
+    <w:p>
+      <w:r>
+        <w:t>thousand.</w:t>
+      </w:r>
+    </w:p>
+    <w:p>
+      <w:pPr>
+        <w:pStyle w:val="Heading1"/>
+      </w:pPr>
+      <w:r>
+        <w:t>Step 9: Transaction Management</w:t>
+      </w:r>
+    </w:p>
+    <w:p>
+      <w:r>
+        <w:t>All tables use InnoDB, so every demonstration runs under ACID with the default</w:t>
+      </w:r>
+    </w:p>
+    <w:p>
+      <w:r>
+        <w:t>REPEATABLE READ isolation. Demo A commits a booking plus its payment together:</w:t>
+      </w:r>
+    </w:p>
+    <w:p>
+      <w:r>
+        <w:t>both rows appear or neither does. Demo B takes the failure path — a payment</w:t>
+      </w:r>
+    </w:p>
+    <w:p>
+      <w:r>
+        <w:t>insert that violates a constraint — and the rollback leaves the seat provably</w:t>
+      </w:r>
+    </w:p>
+    <w:p>
+      <w:r>
+        <w:t>free afterwards, verified by re-selecting it. Demo C uses two simultaneous</w:t>
+      </w:r>
+    </w:p>
+    <w:p>
+      <w:r>
+        <w:t>mysql sessions to make isolation visible: session one opens a transaction and</w:t>
+      </w:r>
+    </w:p>
+    <w:p>
+      <w:r>
+        <w:t>updates a booking status without committing; session two still reads the old</w:t>
+      </w:r>
+    </w:p>
+    <w:p>
+      <w:r>
+        <w:t>status; session one commits; session two re-reads and sees the new status.</w:t>
+      </w:r>
+    </w:p>
+    <w:p>
+      <w:r>
+        <w:t>That invisible-then-visible sequence is isolation demonstrated live rather than</w:t>
+      </w:r>
+    </w:p>
+    <w:p>
+      <w:r>
+        <w:t>defined. Script: advanced/04-transactions.sql, run block by block with</w:t>
+      </w:r>
+    </w:p>
+    <w:p>
+      <w:r>
+        <w:t>screenshots.</w:t>
+      </w:r>
+    </w:p>
+    <w:p>
+      <w:pPr>
+        <w:pStyle w:val="Heading1"/>
+      </w:pPr>
+      <w:r>
+        <w:t>Step 10: Indexing and Optimization</w:t>
+      </w:r>
+    </w:p>
+    <w:p>
+      <w:r>
+        <w:t>InnoDB automatically indexes single-column foreign keys at creation, so those</w:t>
+      </w:r>
+    </w:p>
+    <w:p>
+      <w:r>
+        <w:t>were deliberately not re-indexed — re-indexing them would be ceremony without</w:t>
+      </w:r>
+    </w:p>
+    <w:p>
+      <w:r>
+        <w:t>effect, and the viva defence says exactly that. Four workload-driven indexes</w:t>
+      </w:r>
+    </w:p>
+    <w:p>
+      <w:r>
+        <w:t>were added instead, one per observed access pattern: booking_status (filtered</w:t>
+      </w:r>
+    </w:p>
+    <w:p>
+      <w:r>
+        <w:t>by every operations query over refunds and pending payments),</w:t>
+      </w:r>
+    </w:p>
+    <w:p>
+      <w:r>
+        <w:t>scheduled_departure (every departure-board search is a date-range scan),</w:t>
+      </w:r>
+    </w:p>
+    <w:p>
+      <w:r>
+        <w:t>(last_name, first_name) (desk lookups by family name), and weight_kg (the</w:t>
+      </w:r>
+    </w:p>
+    <w:p>
+      <w:r>
+        <w:t>fee report is a range predicate over twenty kilograms). Method, per the test</w:t>
+      </w:r>
+    </w:p>
+    <w:p>
+      <w:r>
+        <w:t>log: run each EXPLAIN before the CREATE INDEX, screenshot the type and rows</w:t>
+      </w:r>
+    </w:p>
+    <w:p>
+      <w:r>
+        <w:t>columns, create the index, re-run EXPLAIN, screenshot again. The before/after</w:t>
+      </w:r>
+    </w:p>
+    <w:p>
+      <w:r>
+        <w:t>pairs are the Step 10 deliverable. Script: advanced/05-indexes.sql.</w:t>
+      </w:r>
+    </w:p>
+    <w:p>
+      <w:pPr>
+        <w:pStyle w:val="Heading1"/>
+      </w:pPr>
+      <w:r>
+        <w:t>Step 11: Testing and Validation</w:t>
+      </w:r>
+    </w:p>
+    <w:p>
+      <w:r>
+        <w:t>docs/TESTING.md records thirty checks in eight groups. Joins (J1-J10): all ten</w:t>
+      </w:r>
+    </w:p>
+    <w:p>
+      <w:r>
+        <w:t>run clean with non-empty result sets; the LEFT JOIN manifest keeps bag-less</w:t>
+      </w:r>
+    </w:p>
+    <w:p>
+      <w:r>
+        <w:t>bookings visible; the overweight list is non-empty by construction. Analytics</w:t>
+      </w:r>
+    </w:p>
+    <w:p>
+      <w:r>
+        <w:t>(A1-A8): busiest routes match the scheduled frequencies; every load factor</w:t>
+      </w:r>
+    </w:p>
+    <w:p>
+      <w:r>
+        <w:t>lands inside the generator's 35-80 band; fee revenue is positive. Constraints</w:t>
+      </w:r>
+    </w:p>
+    <w:p>
+      <w:r>
+        <w:t>(C-a to C-e): duplicate seat rejected with ERROR 1062; HYD-to-HYD flight</w:t>
+      </w:r>
+    </w:p>
+    <w:p>
+      <w:r>
+        <w:t>rejected; zero-weight bag rejected; airport deletion refused by RESTRICT;</w:t>
+      </w:r>
+    </w:p>
+    <w:p>
+      <w:r>
+        <w:t>booking deletion cascades to bags, payment and check-in with zero orphans.</w:t>
+      </w:r>
+    </w:p>
+    <w:p>
+      <w:r>
+        <w:t>Procedure and trigger (T-a to T-c): MakeBooking returns an id with a matching</w:t>
+      </w:r>
+    </w:p>
+    <w:p>
+      <w:r>
+        <w:t>Pending payment; MakeBooking on a taken seat inserts nothing; booking past</w:t>
+      </w:r>
+    </w:p>
+    <w:p>
+      <w:r>
+        <w:t>capacity raises ERROR 45000. Transactions (D-A to D-C): commit shows both</w:t>
+      </w:r>
+    </w:p>
+    <w:p>
+      <w:r>
+        <w:t>rows; rollback frees the seat; two-session read shows isolation. Indexes</w:t>
+      </w:r>
+    </w:p>
+    <w:p>
+      <w:r>
+        <w:t>(I-a, I-b): EXPLAIN pairs captured; SHOW INDEX confirms exactly the four new</w:t>
+      </w:r>
+    </w:p>
+    <w:p>
+      <w:r>
+        <w:t>indexes. Access control (R-a to R-c): grants match the three roles; viewer</w:t>
+      </w:r>
+    </w:p>
+    <w:p>
+      <w:r>
+        <w:t>INSERT denied; grant names verified character-exact. Scale (S-a, S-b): the</w:t>
+      </w:r>
+    </w:p>
+    <w:p>
+      <w:r>
+        <w:t>row-count query totals 336 departures with bookings and bags in the tens of</w:t>
+      </w:r>
+    </w:p>
+    <w:p>
+      <w:r>
+        <w:t>thousands, and the daily snapshot covers all twenty-one days without gaps.</w:t>
+      </w:r>
+    </w:p>
+    <w:p>
+      <w:r>
+        <w:t>Every check states its expected result before the run, so the log is both the</w:t>
+      </w:r>
+    </w:p>
+    <w:p>
+      <w:r>
+        <w:t>protocol and the evidence.</w:t>
+      </w:r>
+    </w:p>
+    <w:p>
+      <w:pPr>
+        <w:pStyle w:val="Heading1"/>
+      </w:pPr>
+      <w:r>
+        <w:t>Step 12: Documentation</w:t>
+      </w:r>
+    </w:p>
+    <w:p>
+      <w:r>
+        <w:t>This report (REPORT_TEXT.md as the editable source; SkyRoute_DBMS_Report.docx</w:t>
+      </w:r>
+    </w:p>
+    <w:p>
+      <w:r>
+        <w:t>and SkyRoute_Report.pdf generated from it through one shared parser so the</w:t>
+      </w:r>
+    </w:p>
+    <w:p>
+      <w:r>
+        <w:t>three formats cannot drift apart); README.md with run order, users, rules,</w:t>
+      </w:r>
+    </w:p>
+    <w:p>
+      <w:r>
+        <w:t>layout and the screenshot workflow; TESTING.md as the validation protocol;</w:t>
+      </w:r>
+    </w:p>
+    <w:p>
+      <w:r>
+        <w:t>the decision journal C1 through C13 embedded as comments in the SQL sources,</w:t>
+      </w:r>
+    </w:p>
+    <w:p>
+      <w:r>
+        <w:t>tracing each design choice to its requirement; the Chen-style ER diagram with</w:t>
+      </w:r>
+    </w:p>
+    <w:p>
+      <w:r>
+        <w:t>PNG/PDF export; the eleven-slide deck; and the Flask track's brief report,</w:t>
+      </w:r>
+    </w:p>
+    <w:p>
+      <w:r>
+        <w:t>all versioned in the private repository with phase-by-phase commits.</w:t>
+      </w:r>
+    </w:p>
+    <w:p>
+      <w:pPr>
+        <w:pStyle w:val="Heading1"/>
+      </w:pPr>
+      <w:r>
+        <w:t>Step 13: Presentation and Reporting</w:t>
+      </w:r>
+    </w:p>
+    <w:p>
+      <w:r>
+        <w:t>Deliverables: this report (within the fifteen-page limit), the eleven-slide</w:t>
+      </w:r>
+    </w:p>
+    <w:p>
+      <w:r>
+        <w:t>deck (title, problem-to-mechanism map, ER, schema table, scale, advanced SQL,</w:t>
+      </w:r>
+    </w:p>
+    <w:p>
+      <w:r>
+        <w:t>transactions, indexing, access control plus testing, Flask site, result), all</w:t>
+      </w:r>
+    </w:p>
+    <w:p>
+      <w:r>
+        <w:t>source SQL with the deterministic generator, README, test log, and a two to</w:t>
+      </w:r>
+    </w:p>
+    <w:p>
+      <w:r>
+        <w:t>three minute demo video walking the departure board, a live booking, the</w:t>
+      </w:r>
+    </w:p>
+    <w:p>
+      <w:r>
+        <w:t>duplicate-seat refusal and the fee receipt. Suggested viva preparation is the</w:t>
+      </w:r>
+    </w:p>
+    <w:p>
+      <w:r>
+        <w:t>per-track notes file: ten DBMS questions and seven Flask questions, each</w:t>
+      </w:r>
+    </w:p>
+    <w:p>
+      <w:r>
+        <w:t>answerable in three to four sentences, covering concurrency, atomicity,</w:t>
+      </w:r>
+    </w:p>
+    <w:p>
+      <w:r>
+        <w:t>indexing honesty, the table-count challenge, normalisation, isolation, scale</w:t>
+      </w:r>
+    </w:p>
+    <w:p>
+      <w:r>
+        <w:t>and the fee rule.</w:t>
+      </w:r>
+    </w:p>
+    <w:p>
+      <w:pPr>
+        <w:pStyle w:val="Heading1"/>
+      </w:pPr>
+      <w:r>
+        <w:t>Conclusion</w:t>
+      </w:r>
+    </w:p>
+    <w:p>
+      <w:r>
+        <w:t>Every problem-statement item is closed by a named database mechanism, every</w:t>
+      </w:r>
+    </w:p>
+    <w:p>
+      <w:r>
+        <w:t>mechanism has a test with a stated expectation, and the system holds</w:t>
+      </w:r>
+    </w:p>
+    <w:p>
+      <w:r>
+        <w:t>production-shaped volume while answering board, manifest, revenue, load,</w:t>
+      </w:r>
+    </w:p>
+    <w:p>
+      <w:r>
+        <w:t>utilisation and fee questions in single queries. The Flask web project reuses</w:t>
+      </w:r>
+    </w:p>
+    <w:p>
+      <w:r>
+        <w:t>the identical design on SQLite with raw SQL and full CRUD, keeping the same</w:t>
+      </w:r>
+    </w:p>
+    <w:p>
+      <w:r>
+        <w:t>integrity rules visible in application code. The build order itself is the</w:t>
+      </w:r>
+    </w:p>
+    <w:p>
+      <w:r>
+        <w:t>method: masters before operations, constraints before data, rules before</w:t>
+      </w:r>
+    </w:p>
+    <w:p>
+      <w:r>
+        <w:t>applications, measurement before claims.</w:t>
+      </w:r>
+    </w:p>
+    <w:p>
+      <w:pPr>
+        <w:pStyle w:val="Heading1"/>
+      </w:pPr>
+      <w:r>
+        <w:t>References</w:t>
       </w:r>
     </w:p>
     <w:p>
@@ -784,12 +1776,7 @@
         <w:pStyle w:val="ListBullet"/>
       </w:pPr>
       <w:r>
-        <w:t>1NF: repeating groups removed into masters (airline/aircraft data live once,</w:t>
-      </w:r>
-    </w:p>
-    <w:p>
-      <w:r>
-        <w:t>not inside every flight row).</w:t>
+        <w:t>Ramakrishna R., Gehrke J. Database Management Systems, 3rd Ed, McGraw-Hill.</w:t>
       </w:r>
     </w:p>
     <w:p>
@@ -797,12 +1784,7 @@
         <w:pStyle w:val="ListBullet"/>
       </w:pPr>
       <w:r>
-        <w:t>2NF: every non-key attribute depends on the whole key (gate status depends on</w:t>
-      </w:r>
-    </w:p>
-    <w:p>
-      <w:r>
-        <w:t>gate_id, never on a booking).</w:t>
+        <w:t>Silberschatz, Korth, Sudarshan. Database System Concepts, 7th Ed.</w:t>
       </w:r>
     </w:p>
     <w:p>
@@ -810,12 +1792,7 @@
         <w:pStyle w:val="ListBullet"/>
       </w:pPr>
       <w:r>
-        <w:t>3NF: no transitive dependencies (city depends on airport; flights reference</w:t>
-      </w:r>
-    </w:p>
-    <w:p>
-      <w:r>
-        <w:t>the airport rather than copying its city).</w:t>
+        <w:t>Elmasri R., Navathe S. Fundamentals of Database Systems, 5th Ed.</w:t>
       </w:r>
     </w:p>
     <w:p>
@@ -823,359 +1800,7 @@
         <w:pStyle w:val="ListBullet"/>
       </w:pPr>
       <w:r>
-        <w:t>BCNF-clean: every determinant in every table is a key.</w:t>
-      </w:r>
-    </w:p>
-    <w:p>
-      <w:r>
-        <w:t>Key tables and rules: Airports (UNIQUE iata, name); Airlines (UNIQUE name,</w:t>
-      </w:r>
-    </w:p>
-    <w:p>
-      <w:r>
-        <w:t>iata); Aircraft (UNIQUE tail; CHECK capacity 1-850); Flights (UNIQUE number;</w:t>
-      </w:r>
-    </w:p>
-    <w:p>
-      <w:r>
-        <w:t>two airport FKs; CHECK departure &lt;&gt; arrival); Departures</w:t>
-      </w:r>
-    </w:p>
-    <w:p>
-      <w:r>
-        <w:t>(UNIQUE(flight, scheduled_departure); CHECK arrival &gt; departure); Terminals,</w:t>
-      </w:r>
-    </w:p>
-    <w:p>
-      <w:r>
-        <w:t>Gates (UNIQUE per parent - the anti-clash keys); Passengers (UNIQUE</w:t>
-      </w:r>
-    </w:p>
-    <w:p>
-      <w:r>
-        <w:t>passport, email); Bookings (UNIQUE(departure, seat)); Baggage (PK is</w:t>
-      </w:r>
-    </w:p>
-    <w:p>
-      <w:r>
-        <w:t>(booking_id, seq); CHECK 0 &lt; kg &lt;= 100); Payments and Check_Ins (UNIQUE</w:t>
-      </w:r>
-    </w:p>
-    <w:p>
-      <w:r>
-        <w:t>booking_id - one-to-one); Employees + 3 subtypes (subtype PK = supertype PK);</w:t>
-      </w:r>
-    </w:p>
-    <w:p>
-      <w:pPr>
-        <w:pStyle w:val="Heading1"/>
-      </w:pPr>
-      <w:r>
-        <w:t>7. SQL Implementation</w:t>
-      </w:r>
-    </w:p>
-    <w:p>
-      <w:r>
-        <w:t>DDL: 01-travel-core.sql creates the 12 travel tables (CASCADE where children</w:t>
-      </w:r>
-    </w:p>
-    <w:p>
-      <w:r>
-        <w:t>cannot outlive parents, RESTRICT on airports - deleting an airport must never</w:t>
-      </w:r>
-    </w:p>
-    <w:p>
-      <w:r>
-        <w:t>wipe flights). 02-staff-roles.sql adds the staff hierarchy and the DCL: three</w:t>
-      </w:r>
-    </w:p>
-    <w:p>
-      <w:r>
-        <w:t>users (sky_admin full, sky_staff read-write, sky_viewer read-only) with</w:t>
-      </w:r>
-    </w:p>
-    <w:p>
-      <w:r>
-        <w:t>SHOW GRANTS proof on the exact database name.</w:t>
-      </w:r>
-    </w:p>
-    <w:p>
-      <w:r>
-        <w:t>DML: generate.py (seed 42) writes seed_data.sql deterministically - 5 airports,</w:t>
-      </w:r>
-    </w:p>
-    <w:p>
-      <w:r>
-        <w:t>3 airlines, 10 aircraft, 10 scheduled flights, 140 dated departures over 14 days,</w:t>
-      </w:r>
-    </w:p>
-    <w:p>
-      <w:r>
-        <w:t>500 passengers, ~14,000 bookings at 35-80% load factors with seats sampled</w:t>
-      </w:r>
-    </w:p>
-    <w:p>
-      <w:r>
-        <w:t>without replacement, ~14,000 payments, ~17,000 bags (80% under 20 kg, 20%</w:t>
-      </w:r>
-    </w:p>
-    <w:p>
-      <w:r>
-        <w:t>overweight tail for the fee demo), ~5,000 check-ins on past departures, 8</w:t>
-      </w:r>
-    </w:p>
-    <w:p>
-      <w:r>
-        <w:t>staff with subtype rows and crew assignments. Machine-verified: zero duplicate</w:t>
-      </w:r>
-    </w:p>
-    <w:p>
-      <w:r>
-        <w:t>(departure, seat) pairs, all foreign keys in range.</w:t>
-      </w:r>
-    </w:p>
-    <w:p>
-      <w:r>
-        <w:t>DCL: least-privilege roles as above; viewer INSERT is denied.</w:t>
-      </w:r>
-    </w:p>
-    <w:p>
-      <w:pPr>
-        <w:pStyle w:val="Heading1"/>
-      </w:pPr>
-      <w:r>
-        <w:t>8. Advanced SQL Features</w:t>
-      </w:r>
-    </w:p>
-    <w:p>
-      <w:r>
-        <w:t>Views: flight_board_view joins timetable, airports, airline, aircraft, gate and</w:t>
-      </w:r>
-    </w:p>
-    <w:p>
-      <w:r>
-        <w:t>terminal into the single departure-board query. booking_receipt_view returns</w:t>
-      </w:r>
-    </w:p>
-    <w:p>
-      <w:r>
-        <w:t>price plus the computed baggage fee via a scalar subquery (valid under</w:t>
-      </w:r>
-    </w:p>
-    <w:p>
-      <w:r>
-        <w:t>ONLY_FULL_GROUP_BY).</w:t>
-      </w:r>
-    </w:p>
-    <w:p>
-      <w:r>
-        <w:t>Stored procedure: MakeBooking(passenger, departure, seat, class, price, OUT id)</w:t>
-      </w:r>
-    </w:p>
-    <w:p>
-      <w:r>
-        <w:t>inserts the booking and opens its Pending payment inside one transaction with an</w:t>
-      </w:r>
-    </w:p>
-    <w:p>
-      <w:r>
-        <w:t>EXIT HANDLER that rolls back and re-signals on any error.</w:t>
-      </w:r>
-    </w:p>
-    <w:p>
-      <w:r>
-        <w:t>Trigger: trg_booking_capacity (BEFORE INSERT ON Bookings) compares seats sold</w:t>
-      </w:r>
-    </w:p>
-    <w:p>
-      <w:r>
-        <w:t>against the assigned aircraft's capacity and SIGNALs SQLSTATE 45000 when full.</w:t>
-      </w:r>
-    </w:p>
-    <w:p>
-      <w:r>
-        <w:t>It fires for every insert path because the rule lives in the database.</w:t>
-      </w:r>
-    </w:p>
-    <w:p>
-      <w:r>
-        <w:t>Joins and subqueries: 10 join queries across every module; analytics pack with</w:t>
-      </w:r>
-    </w:p>
-    <w:p>
-      <w:r>
-        <w:t>GROUP BY, HAVING, CASE aggregates and a subquery.</w:t>
-      </w:r>
-    </w:p>
-    <w:p>
-      <w:pPr>
-        <w:pStyle w:val="Heading1"/>
-      </w:pPr>
-      <w:r>
-        <w:t>9. Transaction Management</w:t>
-      </w:r>
-    </w:p>
-    <w:p>
-      <w:r>
-        <w:t>InnoDB provides ACID. Demo A commits a booking plus its payment together. Demo</w:t>
-      </w:r>
-    </w:p>
-    <w:p>
-      <w:r>
-        <w:t>B rolls back on payment failure and the seat stays free (atomicity). Demo C uses</w:t>
-      </w:r>
-    </w:p>
-    <w:p>
-      <w:r>
-        <w:t>two simultaneous mysql sessions to show REPEATABLE READ isolation. Script:</w:t>
-      </w:r>
-    </w:p>
-    <w:p>
-      <w:r>
-        <w:t>advanced/04-transactions.sql.</w:t>
-      </w:r>
-    </w:p>
-    <w:p>
-      <w:pPr>
-        <w:pStyle w:val="Heading1"/>
-      </w:pPr>
-      <w:r>
-        <w:t>10. Indexing and Optimization</w:t>
-      </w:r>
-    </w:p>
-    <w:p>
-      <w:r>
-        <w:t>InnoDB auto-indexes single-column foreign keys, so those were deliberately not</w:t>
-      </w:r>
-    </w:p>
-    <w:p>
-      <w:r>
-        <w:t>re-indexed. Four workload-driven indexes: booking_status, scheduled_departure,</w:t>
-      </w:r>
-    </w:p>
-    <w:p>
-      <w:r>
-        <w:t>(last_name, first_name), weight_kg - each with a before/after EXPLAIN pair in</w:t>
-      </w:r>
-    </w:p>
-    <w:p>
-      <w:r>
-        <w:t>the test log showing fewer rows examined. Script: advanced/05-indexes.sql.</w:t>
-      </w:r>
-    </w:p>
-    <w:p>
-      <w:pPr>
-        <w:pStyle w:val="Heading1"/>
-      </w:pPr>
-      <w:r>
-        <w:t>11. Testing and Validation</w:t>
-      </w:r>
-    </w:p>
-    <w:p>
-      <w:r>
-        <w:t>TESTING.md records 30 checks in 8 groups: joins, analytics, constraint rejection</w:t>
-      </w:r>
-    </w:p>
-    <w:p>
-      <w:r>
-        <w:t>(duplicate seat ERROR 1062, impossible route, bad weight, RESTRICT on airports,</w:t>
-      </w:r>
-    </w:p>
-    <w:p>
-      <w:r>
-        <w:t>CASCADE orphan check), procedure atomicity, transaction demos, EXPLAIN pairs,</w:t>
-      </w:r>
-    </w:p>
-    <w:p>
-      <w:r>
-        <w:t>role grants, and scale counts. Every check states its expected result.</w:t>
-      </w:r>
-    </w:p>
-    <w:p>
-      <w:pPr>
-        <w:pStyle w:val="Heading1"/>
-      </w:pPr>
-      <w:r>
-        <w:t>12. Documentation</w:t>
-      </w:r>
-    </w:p>
-    <w:p>
-      <w:r>
-        <w:t>This report; README.md (run order, users, rules, layout, screenshot workflow);</w:t>
-      </w:r>
-    </w:p>
-    <w:p>
-      <w:r>
-        <w:t>TESTING.md (validation protocol); decision journal C1-C13 embedded as comments</w:t>
-      </w:r>
-    </w:p>
-    <w:p>
-      <w:r>
-        <w:t>in the SQL sources; ER diagram; slide deck; Flask brief report.</w:t>
-      </w:r>
-    </w:p>
-    <w:p>
-      <w:pPr>
-        <w:pStyle w:val="Heading1"/>
-      </w:pPr>
-      <w:r>
-        <w:t>13. Presentation and Reporting</w:t>
-      </w:r>
-    </w:p>
-    <w:p>
-      <w:r>
-        <w:t>This report, the 11-slide deck, all source SQL and the generator, README, test</w:t>
-      </w:r>
-    </w:p>
-    <w:p>
-      <w:r>
-        <w:t>log, and a 2-3 minute demo video (departure board, live booking,</w:t>
-      </w:r>
-    </w:p>
-    <w:p>
-      <w:r>
-        <w:t>duplicate-seat refusal, fee receipt).</w:t>
-      </w:r>
-    </w:p>
-    <w:p>
-      <w:pPr>
-        <w:pStyle w:val="Heading1"/>
-      </w:pPr>
-      <w:r>
-        <w:t>Conclusion</w:t>
-      </w:r>
-    </w:p>
-    <w:p>
-      <w:r>
-        <w:t>Every problem-statement item is closed by a named database mechanism, every</w:t>
-      </w:r>
-    </w:p>
-    <w:p>
-      <w:r>
-        <w:t>mechanism has a test, and the system holds production-shaped volume (~14k</w:t>
-      </w:r>
-    </w:p>
-    <w:p>
-      <w:r>
-        <w:t>bookings) while answering analytical questions in single queries. The Flask web</w:t>
-      </w:r>
-    </w:p>
-    <w:p>
-      <w:r>
-        <w:t>project reuses this design on SQLite with raw SQL, keeping the same integrity</w:t>
-      </w:r>
-    </w:p>
-    <w:p>
-      <w:r>
-        <w:t>rules visible in application code.</w:t>
-      </w:r>
-    </w:p>
-    <w:p>
-      <w:pPr>
-        <w:pStyle w:val="Heading1"/>
-      </w:pPr>
-      <w:r>
-        <w:t>References</w:t>
+        <w:t>MySQL 8.0 Reference Manual: constraints, triggers, stored programs, EXPLAIN.</w:t>
       </w:r>
     </w:p>
     <w:p>
@@ -1183,23 +1808,12 @@
         <w:pStyle w:val="ListBullet"/>
       </w:pPr>
       <w:r>
-        <w:t>Ramakrishna R., Gehrke J. Database Management Systems, 3rd Ed, McGraw-Hill.</w:t>
-      </w:r>
-    </w:p>
-    <w:p>
-      <w:pPr>
-        <w:pStyle w:val="ListBullet"/>
-      </w:pPr>
-      <w:r>
-        <w:t>Silberschatz, Korth, Sudarshan. Database System Concepts, 7th Ed.</w:t>
-      </w:r>
-    </w:p>
-    <w:p>
-      <w:pPr>
-        <w:pStyle w:val="ListBullet"/>
-      </w:pPr>
-      <w:r>
-        <w:t>MySQL 8.0 Reference Manual: constraints, triggers, stored programs, EXPLAIN.</w:t>
+        <w:t>Refero Styles, Wise design system (styles.refero.design) for the web</w:t>
+      </w:r>
+    </w:p>
+    <w:p>
+      <w:r>
+        <w:t>interface visual language: forest/lime tokens, pill actions, flat surfaces.</w:t>
       </w:r>
     </w:p>
     <w:sectPr>

</xml_diff>

<commit_message>
Latest build: flow-layout Chen ER, SkyRoute submission title, Flask seat/XSS/edit/test fixes - 28 checks green
</commit_message>
<xml_diff>
--- a/dbms/docs/SkyRoute_DBMS_Report.docx
+++ b/dbms/docs/SkyRoute_DBMS_Report.docx
@@ -7,7 +7,7 @@
         <w:pStyle w:val="Title"/>
       </w:pPr>
       <w:r>
-        <w:t>SkyRoute: Airline Ticket and Baggage Management System</w:t>
+        <w:t>SkyRoute: Airline Booking, Baggage &amp; Staff Operations System</w:t>
       </w:r>
     </w:p>
     <w:p>
@@ -100,12 +100,12 @@
     </w:p>
     <w:p>
       <w:r>
-        <w:t>supertype/subtype hierarchy (Employee with Pilot, Crew_Member and Ground_Staff</w:t>
-      </w:r>
-    </w:p>
-    <w:p>
-      <w:r>
-        <w:t>subtypes). Integrity rules live inside the database rather than in any single</w:t>
+        <w:t>organises staff in role tables sharing each employee's key (Employees 1-1</w:t>
+      </w:r>
+    </w:p>
+    <w:p>
+      <w:r>
+        <w:t>Pilot, Crew_Member and Ground_Staff). Integrity rules live inside the database rather than in any single</w:t>
       </w:r>
     </w:p>
     <w:p>
@@ -170,12 +170,17 @@
     </w:p>
     <w:p>
       <w:r>
-        <w:t>protocol, and the design is carried unchanged into a Flask web application on</w:t>
-      </w:r>
-    </w:p>
-    <w:p>
-      <w:r>
-        <w:t>SQLite with full create/read/update/delete coverage.</w:t>
+        <w:t>protocol, and the design is carried into a Flask staff-portal web application</w:t>
+      </w:r>
+    </w:p>
+    <w:p>
+      <w:r>
+        <w:t>on SQLite — traveler login, per-departure manifests, full create/read/update/delete</w:t>
+      </w:r>
+    </w:p>
+    <w:p>
+      <w:r>
+        <w:t>coverage — reusing the same integrity rules in application code.</w:t>
       </w:r>
     </w:p>
     <w:p>
@@ -188,22 +193,27 @@
     </w:p>
     <w:p>
       <w:r>
-        <w:t>SkyRoute: Airline Ticket and Baggage Management System. The title was chosen to</w:t>
-      </w:r>
-    </w:p>
-    <w:p>
-      <w:r>
-        <w:t>reflect the real-world problem solved — ticketing and baggage handling for</w:t>
-      </w:r>
-    </w:p>
-    <w:p>
-      <w:r>
-        <w:t>scheduled airline operations across multiple airports — rather than a</w:t>
-      </w:r>
-    </w:p>
-    <w:p>
-      <w:r>
-        <w:t>single-route shuttle or a generic "airport database". The subtitle carried</w:t>
+        <w:t>SkyRoute: Airline Booking, Baggage &amp; Staff Operations System. The title was chosen to</w:t>
+      </w:r>
+    </w:p>
+    <w:p>
+      <w:r>
+        <w:t>reflect the real-world problem solved — reservations, baggage handling and</w:t>
+      </w:r>
+    </w:p>
+    <w:p>
+      <w:r>
+        <w:t>staff operations for scheduled airline operations across multiple airports —</w:t>
+      </w:r>
+    </w:p>
+    <w:p>
+      <w:r>
+        <w:t>rather than a single-route shuttle, a generic "airport database", or any</w:t>
+      </w:r>
+    </w:p>
+    <w:p>
+      <w:r>
+        <w:t>"Airport Management System" style title. The subtitle carried</w:t>
       </w:r>
     </w:p>
     <w:p>
@@ -556,7 +566,12 @@
     </w:p>
     <w:p>
       <w:r>
-        <w:t>Employee (supertype) with Pilot, Crew_Member and Ground_Staff subtypes.</w:t>
+        <w:t>Employees with three role tables (Pilots, Crew_Members, Ground_Staff),</w:t>
+      </w:r>
+    </w:p>
+    <w:p>
+      <w:r>
+        <w:t>each 1-1 on the shared employee key.</w:t>
       </w:r>
     </w:p>
     <w:p>
@@ -596,7 +611,7 @@
     </w:p>
     <w:p>
       <w:r>
-        <w:t>1-1 Check_In; Employee 1-1 each subtype through the shared key (a licence row</w:t>
+        <w:t>1-1 Check_In; Employees 1-1 each role table through the shared key (a licence row</w:t>
       </w:r>
     </w:p>
     <w:p>
@@ -1007,7 +1022,7 @@
           </w:tcPr>
           <w:p>
             <w:r>
-              <w:t>Employees + subtypes</w:t>
+              <w:t>Employees + role tables</w:t>
             </w:r>
           </w:p>
         </w:tc>
@@ -1027,7 +1042,7 @@
           </w:tcPr>
           <w:p>
             <w:r>
-              <w:t>subtype PK = supertype PK</w:t>
+              <w:t>role PK = employee PK</w:t>
             </w:r>
           </w:p>
         </w:tc>
@@ -1101,7 +1116,37 @@
     </w:p>
     <w:p>
       <w:r>
-        <w:t>table by table during design review.</w:t>
+        <w:t>table by table during design review. The headline functional dependencies:</w:t>
+      </w:r>
+    </w:p>
+    <w:p>
+      <w:r>
+        <w:t>airport_id determines IATA, name and city; flight_number determines airline</w:t>
+      </w:r>
+    </w:p>
+    <w:p>
+      <w:r>
+        <w:t>and both airports; (flight_id, scheduled_departure) determines one departure;</w:t>
+      </w:r>
+    </w:p>
+    <w:p>
+      <w:r>
+        <w:t>(departure_id, seat_number) determines one booking; (booking_id, baggage_seq)</w:t>
+      </w:r>
+    </w:p>
+    <w:p>
+      <w:r>
+        <w:t>determines one bag weight; tail_number, licence, email, passport and</w:t>
+      </w:r>
+    </w:p>
+    <w:p>
+      <w:r>
+        <w:t>txn_reference each determine their row; employee_id determines the person, with</w:t>
+      </w:r>
+    </w:p>
+    <w:p>
+      <w:r>
+        <w:t>role facts in the role tables keyed by the same id.</w:t>
       </w:r>
     </w:p>
     <w:p>
@@ -1209,7 +1254,7 @@
     </w:p>
     <w:p>
       <w:r>
-        <w:t>days of dated departures (336 departures), five hundred passengers, bookings</w:t>
+        <w:t>days of dated departures (336 departures), four thousand passengers, bookings</w:t>
       </w:r>
     </w:p>
     <w:p>
@@ -1229,7 +1274,7 @@
     </w:p>
     <w:p>
       <w:r>
-        <w:t>the 20 kg allowance (roughly thirty-eight thousand bags, giving the fee demo</w:t>
+        <w:t>the 20 kg allowance (roughly forty-three thousand bags, giving the fee demo</w:t>
       </w:r>
     </w:p>
     <w:p>
@@ -1239,7 +1284,7 @@
     </w:p>
     <w:p>
       <w:r>
-        <w:t>departures, and eight staff with subtype rows. The generated file is</w:t>
+        <w:t>departures, and eight staff with role-table rows. The generated file is</w:t>
       </w:r>
     </w:p>
     <w:p>
@@ -1352,7 +1397,7 @@
     </w:p>
     <w:p>
       <w:r>
-        <w:t>optional bags and check-ins, the double airport role join, supertype/subtype</w:t>
+        <w:t>optional bags and check-ins, the double airport role join, shared-key role-table</w:t>
       </w:r>
     </w:p>
     <w:p>
@@ -1516,7 +1561,7 @@
     </w:p>
     <w:p>
       <w:r>
-        <w:t>docs/TESTING.md records thirty checks in eight groups. Joins (J1-J10): all ten</w:t>
+        <w:t>docs/TESTING.md records twenty-four checks in eight groups. Joins (J1-J10): all ten</w:t>
       </w:r>
     </w:p>
     <w:p>
@@ -1745,12 +1790,17 @@
     </w:p>
     <w:p>
       <w:r>
-        <w:t>the identical design on SQLite with raw SQL and full CRUD, keeping the same</w:t>
-      </w:r>
-    </w:p>
-    <w:p>
-      <w:r>
-        <w:t>integrity rules visible in application code. The build order itself is the</w:t>
+        <w:t>the identical design on SQLite with raw SQL: a staff portal (PIN-gated</w:t>
+      </w:r>
+    </w:p>
+    <w:p>
+      <w:r>
+        <w:t>manifests, check-ins, edits) plus traveler login (unique ID, own bookings</w:t>
+      </w:r>
+    </w:p>
+    <w:p>
+      <w:r>
+        <w:t>only), keeping the same integrity rules visible in application code. The build order itself is the</w:t>
       </w:r>
     </w:p>
     <w:p>

</xml_diff>

<commit_message>
Migrate Flask track to mysql-connector-python on skyroute_app - db.py, schema/seed ports, app + tests, docs
</commit_message>
<xml_diff>
--- a/dbms/docs/SkyRoute_DBMS_Report.docx
+++ b/dbms/docs/SkyRoute_DBMS_Report.docx
@@ -175,12 +175,22 @@
     </w:p>
     <w:p>
       <w:r>
-        <w:t>on SQLite — traveler login, per-departure manifests, full create/read/update/delete</w:t>
-      </w:r>
-    </w:p>
-    <w:p>
-      <w:r>
-        <w:t>coverage — reusing the same integrity rules in application code.</w:t>
+        <w:t>backed by MySQL through mysql-connector-python — traveler login,</w:t>
+      </w:r>
+    </w:p>
+    <w:p>
+      <w:r>
+        <w:t>per-departure manifests, full create/read/update/delete coverage — where</w:t>
+      </w:r>
+    </w:p>
+    <w:p>
+      <w:r>
+        <w:t>every insert, update and delete lands visibly in the database server, reusing</w:t>
+      </w:r>
+    </w:p>
+    <w:p>
+      <w:r>
+        <w:t>the same integrity rules in application code.</w:t>
       </w:r>
     </w:p>
     <w:p>

</xml_diff>

<commit_message>
MySQL migration verified live: explicit FKs, route trigger, buffered cursors, reseed-safe suite - 28 checks green
</commit_message>
<xml_diff>
--- a/dbms/docs/SkyRoute_DBMS_Report.docx
+++ b/dbms/docs/SkyRoute_DBMS_Report.docx
@@ -120,12 +120,17 @@
     </w:p>
     <w:p>
       <w:r>
-        <w:t>gate keys block gate clashes, and check constraints block impossible routes</w:t>
-      </w:r>
-    </w:p>
-    <w:p>
-      <w:r>
-        <w:t>(HYD to HYD), non-positive baggage weights and negative prices. A stored</w:t>
+        <w:t>gate keys block gate clashes, a trigger blocks impossible routes</w:t>
+      </w:r>
+    </w:p>
+    <w:p>
+      <w:r>
+        <w:t>(HYD to HYD), and check constraints block non-positive baggage weights and</w:t>
+      </w:r>
+    </w:p>
+    <w:p>
+      <w:r>
+        <w:t>negative prices. A stored</w:t>
       </w:r>
     </w:p>
     <w:p>
@@ -1601,7 +1606,7 @@
     </w:p>
     <w:p>
       <w:r>
-        <w:t>rejected; zero-weight bag rejected; airport deletion refused by RESTRICT;</w:t>
+        <w:t>rejected by trigger with ERROR 1644; zero-weight bag rejected; airport deletion refused by RESTRICT;</w:t>
       </w:r>
     </w:p>
     <w:p>
@@ -1800,17 +1805,27 @@
     </w:p>
     <w:p>
       <w:r>
-        <w:t>the identical design on SQLite with raw SQL: a staff portal (PIN-gated</w:t>
-      </w:r>
-    </w:p>
-    <w:p>
-      <w:r>
-        <w:t>manifests, check-ins, edits) plus traveler login (unique ID, own bookings</w:t>
-      </w:r>
-    </w:p>
-    <w:p>
-      <w:r>
-        <w:t>only), keeping the same integrity rules visible in application code. The build order itself is the</w:t>
+        <w:t>the identical design on MySQL through mysql-connector-python: a staff portal</w:t>
+      </w:r>
+    </w:p>
+    <w:p>
+      <w:r>
+        <w:t>(PIN-gated manifests, check-ins, edits) plus traveler login (unique ID, own</w:t>
+      </w:r>
+    </w:p>
+    <w:p>
+      <w:r>
+        <w:t>bookings only), so every insert, update and delete lands visibly in the</w:t>
+      </w:r>
+    </w:p>
+    <w:p>
+      <w:r>
+        <w:t>database server while keeping the same integrity rules visible in application</w:t>
+      </w:r>
+    </w:p>
+    <w:p>
+      <w:r>
+        <w:t>code. The build order itself is the</w:t>
       </w:r>
     </w:p>
     <w:p>

</xml_diff>